<commit_message>
them vi du cho race condition
</commit_message>
<xml_diff>
--- a/Phân tích vấn đề.docx
+++ b/Phân tích vấn đề.docx
@@ -614,7 +614,2797 @@
         </w:tc>
       </w:tr>
     </w:tbl>
-    <w:p/>
+    <w:p>
+      <w:pPr>
+        <w:rPr>
+          <w:rFonts w:asciiTheme="majorHAnsi" w:hAnsiTheme="majorHAnsi" w:cstheme="majorHAnsi"/>
+          <w:b/>
+          <w:bCs/>
+        </w:rPr>
+      </w:pPr>
+    </w:p>
+    <w:p>
+      <w:pPr>
+        <w:rPr>
+          <w:rFonts w:asciiTheme="majorHAnsi" w:hAnsiTheme="majorHAnsi" w:cstheme="majorHAnsi"/>
+          <w:b/>
+          <w:bCs/>
+        </w:rPr>
+      </w:pPr>
+      <w:r>
+        <w:rPr>
+          <w:rFonts w:asciiTheme="majorHAnsi" w:hAnsiTheme="majorHAnsi" w:cstheme="majorHAnsi"/>
+          <w:b/>
+          <w:bCs/>
+        </w:rPr>
+        <w:t xml:space="preserve">Ví dụ 1: Mô hình </w:t>
+      </w:r>
+      <w:proofErr w:type="spellStart"/>
+      <w:r>
+        <w:rPr>
+          <w:rFonts w:asciiTheme="majorHAnsi" w:hAnsiTheme="majorHAnsi" w:cstheme="majorHAnsi"/>
+          <w:b/>
+          <w:bCs/>
+        </w:rPr>
+        <w:t>Read-Modify-Write</w:t>
+      </w:r>
+      <w:proofErr w:type="spellEnd"/>
+      <w:r>
+        <w:rPr>
+          <w:rFonts w:asciiTheme="majorHAnsi" w:hAnsiTheme="majorHAnsi" w:cstheme="majorHAnsi"/>
+          <w:b/>
+          <w:bCs/>
+        </w:rPr>
+        <w:t xml:space="preserve"> (Cập nhật biến đếm chung)</w:t>
+      </w:r>
+    </w:p>
+    <w:p>
+      <w:pPr>
+        <w:rPr>
+          <w:rFonts w:asciiTheme="majorHAnsi" w:hAnsiTheme="majorHAnsi" w:cstheme="majorHAnsi"/>
+          <w:i/>
+          <w:iCs/>
+        </w:rPr>
+      </w:pPr>
+      <w:r>
+        <w:rPr>
+          <w:rFonts w:asciiTheme="majorHAnsi" w:hAnsiTheme="majorHAnsi" w:cstheme="majorHAnsi"/>
+          <w:i/>
+          <w:iCs/>
+        </w:rPr>
+        <w:t>// Biến toàn cục chung</w:t>
+      </w:r>
+    </w:p>
+    <w:p>
+      <w:pPr>
+        <w:rPr>
+          <w:rFonts w:asciiTheme="majorHAnsi" w:hAnsiTheme="majorHAnsi" w:cstheme="majorHAnsi"/>
+          <w:i/>
+          <w:iCs/>
+        </w:rPr>
+      </w:pPr>
+      <w:proofErr w:type="spellStart"/>
+      <w:r>
+        <w:rPr>
+          <w:rFonts w:asciiTheme="majorHAnsi" w:hAnsiTheme="majorHAnsi" w:cstheme="majorHAnsi"/>
+          <w:i/>
+          <w:iCs/>
+        </w:rPr>
+        <w:t>shared_counter</w:t>
+      </w:r>
+      <w:proofErr w:type="spellEnd"/>
+      <w:r>
+        <w:rPr>
+          <w:rFonts w:asciiTheme="majorHAnsi" w:hAnsiTheme="majorHAnsi" w:cstheme="majorHAnsi"/>
+          <w:i/>
+          <w:iCs/>
+        </w:rPr>
+        <w:t xml:space="preserve"> = 0;</w:t>
+      </w:r>
+    </w:p>
+    <w:p>
+      <w:pPr>
+        <w:rPr>
+          <w:rFonts w:asciiTheme="majorHAnsi" w:hAnsiTheme="majorHAnsi" w:cstheme="majorHAnsi"/>
+          <w:i/>
+          <w:iCs/>
+        </w:rPr>
+      </w:pPr>
+    </w:p>
+    <w:p>
+      <w:pPr>
+        <w:rPr>
+          <w:rFonts w:asciiTheme="majorHAnsi" w:hAnsiTheme="majorHAnsi" w:cstheme="majorHAnsi"/>
+          <w:i/>
+          <w:iCs/>
+        </w:rPr>
+      </w:pPr>
+      <w:proofErr w:type="spellStart"/>
+      <w:r>
+        <w:rPr>
+          <w:rFonts w:asciiTheme="majorHAnsi" w:hAnsiTheme="majorHAnsi" w:cstheme="majorHAnsi"/>
+          <w:i/>
+          <w:iCs/>
+        </w:rPr>
+        <w:t>Thread</w:t>
+      </w:r>
+      <w:proofErr w:type="spellEnd"/>
+      <w:r>
+        <w:rPr>
+          <w:rFonts w:asciiTheme="majorHAnsi" w:hAnsiTheme="majorHAnsi" w:cstheme="majorHAnsi"/>
+          <w:i/>
+          <w:iCs/>
+        </w:rPr>
+        <w:t xml:space="preserve"> A (Tăng biến đếm):</w:t>
+      </w:r>
+    </w:p>
+    <w:p>
+      <w:pPr>
+        <w:rPr>
+          <w:rFonts w:asciiTheme="majorHAnsi" w:hAnsiTheme="majorHAnsi" w:cstheme="majorHAnsi"/>
+          <w:i/>
+          <w:iCs/>
+        </w:rPr>
+      </w:pPr>
+      <w:r>
+        <w:rPr>
+          <w:rFonts w:asciiTheme="majorHAnsi" w:hAnsiTheme="majorHAnsi" w:cstheme="majorHAnsi"/>
+          <w:i/>
+          <w:iCs/>
+        </w:rPr>
+        <w:t xml:space="preserve">1. </w:t>
+      </w:r>
+      <w:proofErr w:type="spellStart"/>
+      <w:r>
+        <w:rPr>
+          <w:rFonts w:asciiTheme="majorHAnsi" w:hAnsiTheme="majorHAnsi" w:cstheme="majorHAnsi"/>
+          <w:i/>
+          <w:iCs/>
+        </w:rPr>
+        <w:t>regA</w:t>
+      </w:r>
+      <w:proofErr w:type="spellEnd"/>
+      <w:r>
+        <w:rPr>
+          <w:rFonts w:asciiTheme="majorHAnsi" w:hAnsiTheme="majorHAnsi" w:cstheme="majorHAnsi"/>
+          <w:i/>
+          <w:iCs/>
+        </w:rPr>
+        <w:t xml:space="preserve"> = </w:t>
+      </w:r>
+      <w:proofErr w:type="spellStart"/>
+      <w:r>
+        <w:rPr>
+          <w:rFonts w:asciiTheme="majorHAnsi" w:hAnsiTheme="majorHAnsi" w:cstheme="majorHAnsi"/>
+          <w:i/>
+          <w:iCs/>
+        </w:rPr>
+        <w:t>shared_counter</w:t>
+      </w:r>
+      <w:proofErr w:type="spellEnd"/>
+      <w:r>
+        <w:rPr>
+          <w:rFonts w:asciiTheme="majorHAnsi" w:hAnsiTheme="majorHAnsi" w:cstheme="majorHAnsi"/>
+          <w:i/>
+          <w:iCs/>
+        </w:rPr>
+        <w:t xml:space="preserve">  // Đọc: </w:t>
+      </w:r>
+      <w:proofErr w:type="spellStart"/>
+      <w:r>
+        <w:rPr>
+          <w:rFonts w:asciiTheme="majorHAnsi" w:hAnsiTheme="majorHAnsi" w:cstheme="majorHAnsi"/>
+          <w:i/>
+          <w:iCs/>
+        </w:rPr>
+        <w:t>regA</w:t>
+      </w:r>
+      <w:proofErr w:type="spellEnd"/>
+      <w:r>
+        <w:rPr>
+          <w:rFonts w:asciiTheme="majorHAnsi" w:hAnsiTheme="majorHAnsi" w:cstheme="majorHAnsi"/>
+          <w:i/>
+          <w:iCs/>
+        </w:rPr>
+        <w:t xml:space="preserve"> = 0</w:t>
+      </w:r>
+    </w:p>
+    <w:p>
+      <w:pPr>
+        <w:rPr>
+          <w:rFonts w:asciiTheme="majorHAnsi" w:hAnsiTheme="majorHAnsi" w:cstheme="majorHAnsi"/>
+          <w:i/>
+          <w:iCs/>
+        </w:rPr>
+      </w:pPr>
+      <w:r>
+        <w:rPr>
+          <w:rFonts w:asciiTheme="majorHAnsi" w:hAnsiTheme="majorHAnsi" w:cstheme="majorHAnsi"/>
+          <w:i/>
+          <w:iCs/>
+        </w:rPr>
+        <w:t xml:space="preserve">// -- Hệ điều hành ngắt </w:t>
+      </w:r>
+      <w:proofErr w:type="spellStart"/>
+      <w:r>
+        <w:rPr>
+          <w:rFonts w:asciiTheme="majorHAnsi" w:hAnsiTheme="majorHAnsi" w:cstheme="majorHAnsi"/>
+          <w:i/>
+          <w:iCs/>
+        </w:rPr>
+        <w:t>Thread</w:t>
+      </w:r>
+      <w:proofErr w:type="spellEnd"/>
+      <w:r>
+        <w:rPr>
+          <w:rFonts w:asciiTheme="majorHAnsi" w:hAnsiTheme="majorHAnsi" w:cstheme="majorHAnsi"/>
+          <w:i/>
+          <w:iCs/>
+        </w:rPr>
+        <w:t xml:space="preserve"> A, chuyển sang </w:t>
+      </w:r>
+      <w:proofErr w:type="spellStart"/>
+      <w:r>
+        <w:rPr>
+          <w:rFonts w:asciiTheme="majorHAnsi" w:hAnsiTheme="majorHAnsi" w:cstheme="majorHAnsi"/>
+          <w:i/>
+          <w:iCs/>
+        </w:rPr>
+        <w:t>Thread</w:t>
+      </w:r>
+      <w:proofErr w:type="spellEnd"/>
+      <w:r>
+        <w:rPr>
+          <w:rFonts w:asciiTheme="majorHAnsi" w:hAnsiTheme="majorHAnsi" w:cstheme="majorHAnsi"/>
+          <w:i/>
+          <w:iCs/>
+        </w:rPr>
+        <w:t xml:space="preserve"> B --</w:t>
+      </w:r>
+    </w:p>
+    <w:p>
+      <w:pPr>
+        <w:rPr>
+          <w:rFonts w:asciiTheme="majorHAnsi" w:hAnsiTheme="majorHAnsi" w:cstheme="majorHAnsi"/>
+          <w:i/>
+          <w:iCs/>
+        </w:rPr>
+      </w:pPr>
+    </w:p>
+    <w:p>
+      <w:pPr>
+        <w:rPr>
+          <w:rFonts w:asciiTheme="majorHAnsi" w:hAnsiTheme="majorHAnsi" w:cstheme="majorHAnsi"/>
+          <w:i/>
+          <w:iCs/>
+        </w:rPr>
+      </w:pPr>
+      <w:proofErr w:type="spellStart"/>
+      <w:r>
+        <w:rPr>
+          <w:rFonts w:asciiTheme="majorHAnsi" w:hAnsiTheme="majorHAnsi" w:cstheme="majorHAnsi"/>
+          <w:i/>
+          <w:iCs/>
+        </w:rPr>
+        <w:t>Thread</w:t>
+      </w:r>
+      <w:proofErr w:type="spellEnd"/>
+      <w:r>
+        <w:rPr>
+          <w:rFonts w:asciiTheme="majorHAnsi" w:hAnsiTheme="majorHAnsi" w:cstheme="majorHAnsi"/>
+          <w:i/>
+          <w:iCs/>
+        </w:rPr>
+        <w:t xml:space="preserve"> B (Tăng biến đếm):</w:t>
+      </w:r>
+    </w:p>
+    <w:p>
+      <w:pPr>
+        <w:rPr>
+          <w:rFonts w:asciiTheme="majorHAnsi" w:hAnsiTheme="majorHAnsi" w:cstheme="majorHAnsi"/>
+          <w:i/>
+          <w:iCs/>
+        </w:rPr>
+      </w:pPr>
+      <w:r>
+        <w:rPr>
+          <w:rFonts w:asciiTheme="majorHAnsi" w:hAnsiTheme="majorHAnsi" w:cstheme="majorHAnsi"/>
+          <w:i/>
+          <w:iCs/>
+        </w:rPr>
+        <w:t xml:space="preserve">1. </w:t>
+      </w:r>
+      <w:proofErr w:type="spellStart"/>
+      <w:r>
+        <w:rPr>
+          <w:rFonts w:asciiTheme="majorHAnsi" w:hAnsiTheme="majorHAnsi" w:cstheme="majorHAnsi"/>
+          <w:i/>
+          <w:iCs/>
+        </w:rPr>
+        <w:t>regB</w:t>
+      </w:r>
+      <w:proofErr w:type="spellEnd"/>
+      <w:r>
+        <w:rPr>
+          <w:rFonts w:asciiTheme="majorHAnsi" w:hAnsiTheme="majorHAnsi" w:cstheme="majorHAnsi"/>
+          <w:i/>
+          <w:iCs/>
+        </w:rPr>
+        <w:t xml:space="preserve"> = </w:t>
+      </w:r>
+      <w:proofErr w:type="spellStart"/>
+      <w:r>
+        <w:rPr>
+          <w:rFonts w:asciiTheme="majorHAnsi" w:hAnsiTheme="majorHAnsi" w:cstheme="majorHAnsi"/>
+          <w:i/>
+          <w:iCs/>
+        </w:rPr>
+        <w:t>shared_counter</w:t>
+      </w:r>
+      <w:proofErr w:type="spellEnd"/>
+      <w:r>
+        <w:rPr>
+          <w:rFonts w:asciiTheme="majorHAnsi" w:hAnsiTheme="majorHAnsi" w:cstheme="majorHAnsi"/>
+          <w:i/>
+          <w:iCs/>
+        </w:rPr>
+        <w:t xml:space="preserve">  // Đọc: </w:t>
+      </w:r>
+      <w:proofErr w:type="spellStart"/>
+      <w:r>
+        <w:rPr>
+          <w:rFonts w:asciiTheme="majorHAnsi" w:hAnsiTheme="majorHAnsi" w:cstheme="majorHAnsi"/>
+          <w:i/>
+          <w:iCs/>
+        </w:rPr>
+        <w:t>regB</w:t>
+      </w:r>
+      <w:proofErr w:type="spellEnd"/>
+      <w:r>
+        <w:rPr>
+          <w:rFonts w:asciiTheme="majorHAnsi" w:hAnsiTheme="majorHAnsi" w:cstheme="majorHAnsi"/>
+          <w:i/>
+          <w:iCs/>
+        </w:rPr>
+        <w:t xml:space="preserve"> = 0 (do </w:t>
+      </w:r>
+      <w:proofErr w:type="spellStart"/>
+      <w:r>
+        <w:rPr>
+          <w:rFonts w:asciiTheme="majorHAnsi" w:hAnsiTheme="majorHAnsi" w:cstheme="majorHAnsi"/>
+          <w:i/>
+          <w:iCs/>
+        </w:rPr>
+        <w:t>Thread</w:t>
+      </w:r>
+      <w:proofErr w:type="spellEnd"/>
+      <w:r>
+        <w:rPr>
+          <w:rFonts w:asciiTheme="majorHAnsi" w:hAnsiTheme="majorHAnsi" w:cstheme="majorHAnsi"/>
+          <w:i/>
+          <w:iCs/>
+        </w:rPr>
+        <w:t xml:space="preserve"> A chưa kịp ghi xuống)</w:t>
+      </w:r>
+    </w:p>
+    <w:p>
+      <w:pPr>
+        <w:rPr>
+          <w:rFonts w:asciiTheme="majorHAnsi" w:hAnsiTheme="majorHAnsi" w:cstheme="majorHAnsi"/>
+          <w:i/>
+          <w:iCs/>
+        </w:rPr>
+      </w:pPr>
+      <w:r>
+        <w:rPr>
+          <w:rFonts w:asciiTheme="majorHAnsi" w:hAnsiTheme="majorHAnsi" w:cstheme="majorHAnsi"/>
+          <w:i/>
+          <w:iCs/>
+        </w:rPr>
+        <w:t xml:space="preserve">2. </w:t>
+      </w:r>
+      <w:proofErr w:type="spellStart"/>
+      <w:r>
+        <w:rPr>
+          <w:rFonts w:asciiTheme="majorHAnsi" w:hAnsiTheme="majorHAnsi" w:cstheme="majorHAnsi"/>
+          <w:i/>
+          <w:iCs/>
+        </w:rPr>
+        <w:t>regB</w:t>
+      </w:r>
+      <w:proofErr w:type="spellEnd"/>
+      <w:r>
+        <w:rPr>
+          <w:rFonts w:asciiTheme="majorHAnsi" w:hAnsiTheme="majorHAnsi" w:cstheme="majorHAnsi"/>
+          <w:i/>
+          <w:iCs/>
+        </w:rPr>
+        <w:t xml:space="preserve"> = </w:t>
+      </w:r>
+      <w:proofErr w:type="spellStart"/>
+      <w:r>
+        <w:rPr>
+          <w:rFonts w:asciiTheme="majorHAnsi" w:hAnsiTheme="majorHAnsi" w:cstheme="majorHAnsi"/>
+          <w:i/>
+          <w:iCs/>
+        </w:rPr>
+        <w:t>regB</w:t>
+      </w:r>
+      <w:proofErr w:type="spellEnd"/>
+      <w:r>
+        <w:rPr>
+          <w:rFonts w:asciiTheme="majorHAnsi" w:hAnsiTheme="majorHAnsi" w:cstheme="majorHAnsi"/>
+          <w:i/>
+          <w:iCs/>
+        </w:rPr>
+        <w:t xml:space="preserve"> + 1        // </w:t>
+      </w:r>
+      <w:proofErr w:type="spellStart"/>
+      <w:r>
+        <w:rPr>
+          <w:rFonts w:asciiTheme="majorHAnsi" w:hAnsiTheme="majorHAnsi" w:cstheme="majorHAnsi"/>
+          <w:i/>
+          <w:iCs/>
+        </w:rPr>
+        <w:t>regB</w:t>
+      </w:r>
+      <w:proofErr w:type="spellEnd"/>
+      <w:r>
+        <w:rPr>
+          <w:rFonts w:asciiTheme="majorHAnsi" w:hAnsiTheme="majorHAnsi" w:cstheme="majorHAnsi"/>
+          <w:i/>
+          <w:iCs/>
+        </w:rPr>
+        <w:t xml:space="preserve"> = 1</w:t>
+      </w:r>
+    </w:p>
+    <w:p>
+      <w:pPr>
+        <w:rPr>
+          <w:rFonts w:asciiTheme="majorHAnsi" w:hAnsiTheme="majorHAnsi" w:cstheme="majorHAnsi"/>
+          <w:i/>
+          <w:iCs/>
+        </w:rPr>
+      </w:pPr>
+      <w:r>
+        <w:rPr>
+          <w:rFonts w:asciiTheme="majorHAnsi" w:hAnsiTheme="majorHAnsi" w:cstheme="majorHAnsi"/>
+          <w:i/>
+          <w:iCs/>
+        </w:rPr>
+        <w:t xml:space="preserve">3. </w:t>
+      </w:r>
+      <w:proofErr w:type="spellStart"/>
+      <w:r>
+        <w:rPr>
+          <w:rFonts w:asciiTheme="majorHAnsi" w:hAnsiTheme="majorHAnsi" w:cstheme="majorHAnsi"/>
+          <w:i/>
+          <w:iCs/>
+        </w:rPr>
+        <w:t>shared_counter</w:t>
+      </w:r>
+      <w:proofErr w:type="spellEnd"/>
+      <w:r>
+        <w:rPr>
+          <w:rFonts w:asciiTheme="majorHAnsi" w:hAnsiTheme="majorHAnsi" w:cstheme="majorHAnsi"/>
+          <w:i/>
+          <w:iCs/>
+        </w:rPr>
+        <w:t xml:space="preserve"> = </w:t>
+      </w:r>
+      <w:proofErr w:type="spellStart"/>
+      <w:r>
+        <w:rPr>
+          <w:rFonts w:asciiTheme="majorHAnsi" w:hAnsiTheme="majorHAnsi" w:cstheme="majorHAnsi"/>
+          <w:i/>
+          <w:iCs/>
+        </w:rPr>
+        <w:t>regB</w:t>
+      </w:r>
+      <w:proofErr w:type="spellEnd"/>
+      <w:r>
+        <w:rPr>
+          <w:rFonts w:asciiTheme="majorHAnsi" w:hAnsiTheme="majorHAnsi" w:cstheme="majorHAnsi"/>
+          <w:i/>
+          <w:iCs/>
+        </w:rPr>
+        <w:t xml:space="preserve">  // Ghi: </w:t>
+      </w:r>
+      <w:proofErr w:type="spellStart"/>
+      <w:r>
+        <w:rPr>
+          <w:rFonts w:asciiTheme="majorHAnsi" w:hAnsiTheme="majorHAnsi" w:cstheme="majorHAnsi"/>
+          <w:i/>
+          <w:iCs/>
+        </w:rPr>
+        <w:t>shared_counter</w:t>
+      </w:r>
+      <w:proofErr w:type="spellEnd"/>
+      <w:r>
+        <w:rPr>
+          <w:rFonts w:asciiTheme="majorHAnsi" w:hAnsiTheme="majorHAnsi" w:cstheme="majorHAnsi"/>
+          <w:i/>
+          <w:iCs/>
+        </w:rPr>
+        <w:t xml:space="preserve"> = 1</w:t>
+      </w:r>
+    </w:p>
+    <w:p>
+      <w:pPr>
+        <w:rPr>
+          <w:rFonts w:asciiTheme="majorHAnsi" w:hAnsiTheme="majorHAnsi" w:cstheme="majorHAnsi"/>
+          <w:i/>
+          <w:iCs/>
+        </w:rPr>
+      </w:pPr>
+    </w:p>
+    <w:p>
+      <w:pPr>
+        <w:rPr>
+          <w:rFonts w:asciiTheme="majorHAnsi" w:hAnsiTheme="majorHAnsi" w:cstheme="majorHAnsi"/>
+          <w:i/>
+          <w:iCs/>
+        </w:rPr>
+      </w:pPr>
+      <w:r>
+        <w:rPr>
+          <w:rFonts w:asciiTheme="majorHAnsi" w:hAnsiTheme="majorHAnsi" w:cstheme="majorHAnsi"/>
+          <w:i/>
+          <w:iCs/>
+        </w:rPr>
+        <w:t xml:space="preserve">// -- OS cấp lại CPU cho </w:t>
+      </w:r>
+      <w:proofErr w:type="spellStart"/>
+      <w:r>
+        <w:rPr>
+          <w:rFonts w:asciiTheme="majorHAnsi" w:hAnsiTheme="majorHAnsi" w:cstheme="majorHAnsi"/>
+          <w:i/>
+          <w:iCs/>
+        </w:rPr>
+        <w:t>Thread</w:t>
+      </w:r>
+      <w:proofErr w:type="spellEnd"/>
+      <w:r>
+        <w:rPr>
+          <w:rFonts w:asciiTheme="majorHAnsi" w:hAnsiTheme="majorHAnsi" w:cstheme="majorHAnsi"/>
+          <w:i/>
+          <w:iCs/>
+        </w:rPr>
+        <w:t xml:space="preserve"> A --</w:t>
+      </w:r>
+    </w:p>
+    <w:p>
+      <w:pPr>
+        <w:rPr>
+          <w:rFonts w:asciiTheme="majorHAnsi" w:hAnsiTheme="majorHAnsi" w:cstheme="majorHAnsi"/>
+          <w:i/>
+          <w:iCs/>
+        </w:rPr>
+      </w:pPr>
+      <w:r>
+        <w:rPr>
+          <w:rFonts w:asciiTheme="majorHAnsi" w:hAnsiTheme="majorHAnsi" w:cstheme="majorHAnsi"/>
+          <w:i/>
+          <w:iCs/>
+        </w:rPr>
+        <w:t xml:space="preserve">// </w:t>
+      </w:r>
+      <w:proofErr w:type="spellStart"/>
+      <w:r>
+        <w:rPr>
+          <w:rFonts w:asciiTheme="majorHAnsi" w:hAnsiTheme="majorHAnsi" w:cstheme="majorHAnsi"/>
+          <w:i/>
+          <w:iCs/>
+        </w:rPr>
+        <w:t>Thread</w:t>
+      </w:r>
+      <w:proofErr w:type="spellEnd"/>
+      <w:r>
+        <w:rPr>
+          <w:rFonts w:asciiTheme="majorHAnsi" w:hAnsiTheme="majorHAnsi" w:cstheme="majorHAnsi"/>
+          <w:i/>
+          <w:iCs/>
+        </w:rPr>
+        <w:t xml:space="preserve"> A chạy tiếp bước 2 và 3 của nó</w:t>
+      </w:r>
+    </w:p>
+    <w:p>
+      <w:pPr>
+        <w:rPr>
+          <w:rFonts w:asciiTheme="majorHAnsi" w:hAnsiTheme="majorHAnsi" w:cstheme="majorHAnsi"/>
+          <w:i/>
+          <w:iCs/>
+        </w:rPr>
+      </w:pPr>
+      <w:r>
+        <w:rPr>
+          <w:rFonts w:asciiTheme="majorHAnsi" w:hAnsiTheme="majorHAnsi" w:cstheme="majorHAnsi"/>
+          <w:i/>
+          <w:iCs/>
+        </w:rPr>
+        <w:t xml:space="preserve">2. </w:t>
+      </w:r>
+      <w:proofErr w:type="spellStart"/>
+      <w:r>
+        <w:rPr>
+          <w:rFonts w:asciiTheme="majorHAnsi" w:hAnsiTheme="majorHAnsi" w:cstheme="majorHAnsi"/>
+          <w:i/>
+          <w:iCs/>
+        </w:rPr>
+        <w:t>regA</w:t>
+      </w:r>
+      <w:proofErr w:type="spellEnd"/>
+      <w:r>
+        <w:rPr>
+          <w:rFonts w:asciiTheme="majorHAnsi" w:hAnsiTheme="majorHAnsi" w:cstheme="majorHAnsi"/>
+          <w:i/>
+          <w:iCs/>
+        </w:rPr>
+        <w:t xml:space="preserve"> = </w:t>
+      </w:r>
+      <w:proofErr w:type="spellStart"/>
+      <w:r>
+        <w:rPr>
+          <w:rFonts w:asciiTheme="majorHAnsi" w:hAnsiTheme="majorHAnsi" w:cstheme="majorHAnsi"/>
+          <w:i/>
+          <w:iCs/>
+        </w:rPr>
+        <w:t>regA</w:t>
+      </w:r>
+      <w:proofErr w:type="spellEnd"/>
+      <w:r>
+        <w:rPr>
+          <w:rFonts w:asciiTheme="majorHAnsi" w:hAnsiTheme="majorHAnsi" w:cstheme="majorHAnsi"/>
+          <w:i/>
+          <w:iCs/>
+        </w:rPr>
+        <w:t xml:space="preserve"> + 1        // </w:t>
+      </w:r>
+      <w:proofErr w:type="spellStart"/>
+      <w:r>
+        <w:rPr>
+          <w:rFonts w:asciiTheme="majorHAnsi" w:hAnsiTheme="majorHAnsi" w:cstheme="majorHAnsi"/>
+          <w:i/>
+          <w:iCs/>
+        </w:rPr>
+        <w:t>regA</w:t>
+      </w:r>
+      <w:proofErr w:type="spellEnd"/>
+      <w:r>
+        <w:rPr>
+          <w:rFonts w:asciiTheme="majorHAnsi" w:hAnsiTheme="majorHAnsi" w:cstheme="majorHAnsi"/>
+          <w:i/>
+          <w:iCs/>
+        </w:rPr>
+        <w:t xml:space="preserve"> = 1</w:t>
+      </w:r>
+    </w:p>
+    <w:p>
+      <w:pPr>
+        <w:rPr>
+          <w:rFonts w:asciiTheme="majorHAnsi" w:hAnsiTheme="majorHAnsi" w:cstheme="majorHAnsi"/>
+          <w:i/>
+          <w:iCs/>
+        </w:rPr>
+      </w:pPr>
+      <w:r>
+        <w:rPr>
+          <w:rFonts w:asciiTheme="majorHAnsi" w:hAnsiTheme="majorHAnsi" w:cstheme="majorHAnsi"/>
+          <w:i/>
+          <w:iCs/>
+        </w:rPr>
+        <w:t xml:space="preserve">3. </w:t>
+      </w:r>
+      <w:proofErr w:type="spellStart"/>
+      <w:r>
+        <w:rPr>
+          <w:rFonts w:asciiTheme="majorHAnsi" w:hAnsiTheme="majorHAnsi" w:cstheme="majorHAnsi"/>
+          <w:i/>
+          <w:iCs/>
+        </w:rPr>
+        <w:t>shared_counter</w:t>
+      </w:r>
+      <w:proofErr w:type="spellEnd"/>
+      <w:r>
+        <w:rPr>
+          <w:rFonts w:asciiTheme="majorHAnsi" w:hAnsiTheme="majorHAnsi" w:cstheme="majorHAnsi"/>
+          <w:i/>
+          <w:iCs/>
+        </w:rPr>
+        <w:t xml:space="preserve"> = </w:t>
+      </w:r>
+      <w:proofErr w:type="spellStart"/>
+      <w:r>
+        <w:rPr>
+          <w:rFonts w:asciiTheme="majorHAnsi" w:hAnsiTheme="majorHAnsi" w:cstheme="majorHAnsi"/>
+          <w:i/>
+          <w:iCs/>
+        </w:rPr>
+        <w:t>regA</w:t>
+      </w:r>
+      <w:proofErr w:type="spellEnd"/>
+      <w:r>
+        <w:rPr>
+          <w:rFonts w:asciiTheme="majorHAnsi" w:hAnsiTheme="majorHAnsi" w:cstheme="majorHAnsi"/>
+          <w:i/>
+          <w:iCs/>
+        </w:rPr>
+        <w:t xml:space="preserve">  // Ghi đè: </w:t>
+      </w:r>
+      <w:proofErr w:type="spellStart"/>
+      <w:r>
+        <w:rPr>
+          <w:rFonts w:asciiTheme="majorHAnsi" w:hAnsiTheme="majorHAnsi" w:cstheme="majorHAnsi"/>
+          <w:i/>
+          <w:iCs/>
+        </w:rPr>
+        <w:t>shared_counter</w:t>
+      </w:r>
+      <w:proofErr w:type="spellEnd"/>
+      <w:r>
+        <w:rPr>
+          <w:rFonts w:asciiTheme="majorHAnsi" w:hAnsiTheme="majorHAnsi" w:cstheme="majorHAnsi"/>
+          <w:i/>
+          <w:iCs/>
+        </w:rPr>
+        <w:t xml:space="preserve"> = 1</w:t>
+      </w:r>
+    </w:p>
+    <w:p>
+      <w:pPr>
+        <w:rPr>
+          <w:rFonts w:asciiTheme="majorHAnsi" w:hAnsiTheme="majorHAnsi" w:cstheme="majorHAnsi"/>
+          <w:i/>
+          <w:iCs/>
+        </w:rPr>
+      </w:pPr>
+    </w:p>
+    <w:p>
+      <w:pPr>
+        <w:rPr>
+          <w:rFonts w:asciiTheme="majorHAnsi" w:hAnsiTheme="majorHAnsi" w:cstheme="majorHAnsi"/>
+        </w:rPr>
+      </w:pPr>
+      <w:r>
+        <w:rPr>
+          <w:rFonts w:asciiTheme="majorHAnsi" w:hAnsiTheme="majorHAnsi" w:cstheme="majorHAnsi"/>
+          <w:b/>
+          <w:bCs/>
+        </w:rPr>
+        <w:t>Hậu quả:</w:t>
+      </w:r>
+      <w:r>
+        <w:rPr>
+          <w:rFonts w:asciiTheme="majorHAnsi" w:hAnsiTheme="majorHAnsi" w:cstheme="majorHAnsi"/>
+        </w:rPr>
+        <w:t xml:space="preserve"> Mặc dù có 2 luồng cùng thực hiện lệnh tăng biến đếm, kết quả cuối cùng lại là 1 thay vì 2. Quá trình cập nhật của một trong hai luồng đã bị ghi đè và biến mất (</w:t>
+      </w:r>
+      <w:proofErr w:type="spellStart"/>
+      <w:r>
+        <w:rPr>
+          <w:rFonts w:asciiTheme="majorHAnsi" w:hAnsiTheme="majorHAnsi" w:cstheme="majorHAnsi"/>
+        </w:rPr>
+        <w:t>Lost</w:t>
+      </w:r>
+      <w:proofErr w:type="spellEnd"/>
+      <w:r>
+        <w:rPr>
+          <w:rFonts w:asciiTheme="majorHAnsi" w:hAnsiTheme="majorHAnsi" w:cstheme="majorHAnsi"/>
+        </w:rPr>
+        <w:t xml:space="preserve"> </w:t>
+      </w:r>
+      <w:proofErr w:type="spellStart"/>
+      <w:r>
+        <w:rPr>
+          <w:rFonts w:asciiTheme="majorHAnsi" w:hAnsiTheme="majorHAnsi" w:cstheme="majorHAnsi"/>
+        </w:rPr>
+        <w:t>Update</w:t>
+      </w:r>
+      <w:proofErr w:type="spellEnd"/>
+      <w:r>
+        <w:rPr>
+          <w:rFonts w:asciiTheme="majorHAnsi" w:hAnsiTheme="majorHAnsi" w:cstheme="majorHAnsi"/>
+        </w:rPr>
+        <w:t>).</w:t>
+      </w:r>
+    </w:p>
+    <w:p>
+      <w:pPr>
+        <w:rPr>
+          <w:rFonts w:asciiTheme="majorHAnsi" w:hAnsiTheme="majorHAnsi" w:cstheme="majorHAnsi"/>
+        </w:rPr>
+      </w:pPr>
+    </w:p>
+    <w:p>
+      <w:pPr>
+        <w:rPr>
+          <w:rFonts w:asciiTheme="majorHAnsi" w:hAnsiTheme="majorHAnsi" w:cstheme="majorHAnsi"/>
+          <w:b/>
+          <w:bCs/>
+        </w:rPr>
+      </w:pPr>
+      <w:r>
+        <w:rPr>
+          <w:rFonts w:asciiTheme="majorHAnsi" w:hAnsiTheme="majorHAnsi" w:cstheme="majorHAnsi"/>
+          <w:b/>
+          <w:bCs/>
+        </w:rPr>
+        <w:t xml:space="preserve">Ví dụ 2: Mô hình </w:t>
+      </w:r>
+      <w:proofErr w:type="spellStart"/>
+      <w:r>
+        <w:rPr>
+          <w:rFonts w:asciiTheme="majorHAnsi" w:hAnsiTheme="majorHAnsi" w:cstheme="majorHAnsi"/>
+          <w:b/>
+          <w:bCs/>
+        </w:rPr>
+        <w:t>Check</w:t>
+      </w:r>
+      <w:proofErr w:type="spellEnd"/>
+      <w:r>
+        <w:rPr>
+          <w:rFonts w:asciiTheme="majorHAnsi" w:hAnsiTheme="majorHAnsi" w:cstheme="majorHAnsi"/>
+          <w:b/>
+          <w:bCs/>
+        </w:rPr>
+        <w:t>-then-</w:t>
+      </w:r>
+      <w:proofErr w:type="spellStart"/>
+      <w:r>
+        <w:rPr>
+          <w:rFonts w:asciiTheme="majorHAnsi" w:hAnsiTheme="majorHAnsi" w:cstheme="majorHAnsi"/>
+          <w:b/>
+          <w:bCs/>
+        </w:rPr>
+        <w:t>Act</w:t>
+      </w:r>
+      <w:proofErr w:type="spellEnd"/>
+      <w:r>
+        <w:rPr>
+          <w:rFonts w:asciiTheme="majorHAnsi" w:hAnsiTheme="majorHAnsi" w:cstheme="majorHAnsi"/>
+          <w:b/>
+          <w:bCs/>
+        </w:rPr>
+        <w:t xml:space="preserve"> (Kiểm tra rồi mới hành động)</w:t>
+      </w:r>
+    </w:p>
+    <w:p>
+      <w:pPr>
+        <w:rPr>
+          <w:rFonts w:asciiTheme="majorHAnsi" w:hAnsiTheme="majorHAnsi" w:cstheme="majorHAnsi"/>
+          <w:b/>
+          <w:bCs/>
+        </w:rPr>
+      </w:pPr>
+    </w:p>
+    <w:p>
+      <w:pPr>
+        <w:rPr>
+          <w:rFonts w:asciiTheme="majorHAnsi" w:hAnsiTheme="majorHAnsi" w:cstheme="majorHAnsi"/>
+          <w:i/>
+          <w:iCs/>
+        </w:rPr>
+      </w:pPr>
+      <w:r>
+        <w:rPr>
+          <w:rFonts w:asciiTheme="majorHAnsi" w:hAnsiTheme="majorHAnsi" w:cstheme="majorHAnsi"/>
+          <w:i/>
+          <w:iCs/>
+        </w:rPr>
+        <w:t>// Số vé máy bay còn lại trong kho</w:t>
+      </w:r>
+    </w:p>
+    <w:p>
+      <w:pPr>
+        <w:rPr>
+          <w:rFonts w:asciiTheme="majorHAnsi" w:hAnsiTheme="majorHAnsi" w:cstheme="majorHAnsi"/>
+          <w:i/>
+          <w:iCs/>
+        </w:rPr>
+      </w:pPr>
+      <w:proofErr w:type="spellStart"/>
+      <w:r>
+        <w:rPr>
+          <w:rFonts w:asciiTheme="majorHAnsi" w:hAnsiTheme="majorHAnsi" w:cstheme="majorHAnsi"/>
+          <w:i/>
+          <w:iCs/>
+        </w:rPr>
+        <w:t>tickets_available</w:t>
+      </w:r>
+      <w:proofErr w:type="spellEnd"/>
+      <w:r>
+        <w:rPr>
+          <w:rFonts w:asciiTheme="majorHAnsi" w:hAnsiTheme="majorHAnsi" w:cstheme="majorHAnsi"/>
+          <w:i/>
+          <w:iCs/>
+        </w:rPr>
+        <w:t xml:space="preserve"> = 1;</w:t>
+      </w:r>
+    </w:p>
+    <w:p>
+      <w:pPr>
+        <w:rPr>
+          <w:rFonts w:asciiTheme="majorHAnsi" w:hAnsiTheme="majorHAnsi" w:cstheme="majorHAnsi"/>
+          <w:i/>
+          <w:iCs/>
+        </w:rPr>
+      </w:pPr>
+    </w:p>
+    <w:p>
+      <w:pPr>
+        <w:rPr>
+          <w:rFonts w:asciiTheme="majorHAnsi" w:hAnsiTheme="majorHAnsi" w:cstheme="majorHAnsi"/>
+          <w:i/>
+          <w:iCs/>
+        </w:rPr>
+      </w:pPr>
+      <w:proofErr w:type="spellStart"/>
+      <w:r>
+        <w:rPr>
+          <w:rFonts w:asciiTheme="majorHAnsi" w:hAnsiTheme="majorHAnsi" w:cstheme="majorHAnsi"/>
+          <w:i/>
+          <w:iCs/>
+        </w:rPr>
+        <w:t>Thread</w:t>
+      </w:r>
+      <w:proofErr w:type="spellEnd"/>
+      <w:r>
+        <w:rPr>
+          <w:rFonts w:asciiTheme="majorHAnsi" w:hAnsiTheme="majorHAnsi" w:cstheme="majorHAnsi"/>
+          <w:i/>
+          <w:iCs/>
+        </w:rPr>
+        <w:t xml:space="preserve"> A (Người dùng A đặt vé):</w:t>
+      </w:r>
+    </w:p>
+    <w:p>
+      <w:pPr>
+        <w:rPr>
+          <w:rFonts w:asciiTheme="majorHAnsi" w:hAnsiTheme="majorHAnsi" w:cstheme="majorHAnsi"/>
+          <w:i/>
+          <w:iCs/>
+        </w:rPr>
+      </w:pPr>
+      <w:r>
+        <w:rPr>
+          <w:rFonts w:asciiTheme="majorHAnsi" w:hAnsiTheme="majorHAnsi" w:cstheme="majorHAnsi"/>
+          <w:i/>
+          <w:iCs/>
+        </w:rPr>
+        <w:t xml:space="preserve">1. </w:t>
+      </w:r>
+      <w:proofErr w:type="spellStart"/>
+      <w:r>
+        <w:rPr>
+          <w:rFonts w:asciiTheme="majorHAnsi" w:hAnsiTheme="majorHAnsi" w:cstheme="majorHAnsi"/>
+          <w:i/>
+          <w:iCs/>
+        </w:rPr>
+        <w:t>if</w:t>
+      </w:r>
+      <w:proofErr w:type="spellEnd"/>
+      <w:r>
+        <w:rPr>
+          <w:rFonts w:asciiTheme="majorHAnsi" w:hAnsiTheme="majorHAnsi" w:cstheme="majorHAnsi"/>
+          <w:i/>
+          <w:iCs/>
+        </w:rPr>
+        <w:t xml:space="preserve"> (</w:t>
+      </w:r>
+      <w:proofErr w:type="spellStart"/>
+      <w:r>
+        <w:rPr>
+          <w:rFonts w:asciiTheme="majorHAnsi" w:hAnsiTheme="majorHAnsi" w:cstheme="majorHAnsi"/>
+          <w:i/>
+          <w:iCs/>
+        </w:rPr>
+        <w:t>tickets_available</w:t>
+      </w:r>
+      <w:proofErr w:type="spellEnd"/>
+      <w:r>
+        <w:rPr>
+          <w:rFonts w:asciiTheme="majorHAnsi" w:hAnsiTheme="majorHAnsi" w:cstheme="majorHAnsi"/>
+          <w:i/>
+          <w:iCs/>
+        </w:rPr>
+        <w:t xml:space="preserve"> &gt; 0) {</w:t>
+      </w:r>
+    </w:p>
+    <w:p>
+      <w:pPr>
+        <w:rPr>
+          <w:rFonts w:asciiTheme="majorHAnsi" w:hAnsiTheme="majorHAnsi" w:cstheme="majorHAnsi"/>
+          <w:i/>
+          <w:iCs/>
+        </w:rPr>
+      </w:pPr>
+      <w:r>
+        <w:rPr>
+          <w:rFonts w:asciiTheme="majorHAnsi" w:hAnsiTheme="majorHAnsi" w:cstheme="majorHAnsi"/>
+          <w:i/>
+          <w:iCs/>
+        </w:rPr>
+        <w:t>// -- Bị ngắt ngay sau khi vừa vượt qua vòng kiểm tra điều kiện --</w:t>
+      </w:r>
+    </w:p>
+    <w:p>
+      <w:pPr>
+        <w:rPr>
+          <w:rFonts w:asciiTheme="majorHAnsi" w:hAnsiTheme="majorHAnsi" w:cstheme="majorHAnsi"/>
+          <w:i/>
+          <w:iCs/>
+        </w:rPr>
+      </w:pPr>
+    </w:p>
+    <w:p>
+      <w:pPr>
+        <w:rPr>
+          <w:rFonts w:asciiTheme="majorHAnsi" w:hAnsiTheme="majorHAnsi" w:cstheme="majorHAnsi"/>
+          <w:i/>
+          <w:iCs/>
+        </w:rPr>
+      </w:pPr>
+      <w:proofErr w:type="spellStart"/>
+      <w:r>
+        <w:rPr>
+          <w:rFonts w:asciiTheme="majorHAnsi" w:hAnsiTheme="majorHAnsi" w:cstheme="majorHAnsi"/>
+          <w:i/>
+          <w:iCs/>
+        </w:rPr>
+        <w:t>Thread</w:t>
+      </w:r>
+      <w:proofErr w:type="spellEnd"/>
+      <w:r>
+        <w:rPr>
+          <w:rFonts w:asciiTheme="majorHAnsi" w:hAnsiTheme="majorHAnsi" w:cstheme="majorHAnsi"/>
+          <w:i/>
+          <w:iCs/>
+        </w:rPr>
+        <w:t xml:space="preserve"> B (Người dùng B đặt vé):</w:t>
+      </w:r>
+    </w:p>
+    <w:p>
+      <w:pPr>
+        <w:rPr>
+          <w:rFonts w:asciiTheme="majorHAnsi" w:hAnsiTheme="majorHAnsi" w:cstheme="majorHAnsi"/>
+          <w:i/>
+          <w:iCs/>
+        </w:rPr>
+      </w:pPr>
+      <w:r>
+        <w:rPr>
+          <w:rFonts w:asciiTheme="majorHAnsi" w:hAnsiTheme="majorHAnsi" w:cstheme="majorHAnsi"/>
+          <w:i/>
+          <w:iCs/>
+        </w:rPr>
+        <w:t xml:space="preserve">1. </w:t>
+      </w:r>
+      <w:proofErr w:type="spellStart"/>
+      <w:r>
+        <w:rPr>
+          <w:rFonts w:asciiTheme="majorHAnsi" w:hAnsiTheme="majorHAnsi" w:cstheme="majorHAnsi"/>
+          <w:i/>
+          <w:iCs/>
+        </w:rPr>
+        <w:t>if</w:t>
+      </w:r>
+      <w:proofErr w:type="spellEnd"/>
+      <w:r>
+        <w:rPr>
+          <w:rFonts w:asciiTheme="majorHAnsi" w:hAnsiTheme="majorHAnsi" w:cstheme="majorHAnsi"/>
+          <w:i/>
+          <w:iCs/>
+        </w:rPr>
+        <w:t xml:space="preserve"> (</w:t>
+      </w:r>
+      <w:proofErr w:type="spellStart"/>
+      <w:r>
+        <w:rPr>
+          <w:rFonts w:asciiTheme="majorHAnsi" w:hAnsiTheme="majorHAnsi" w:cstheme="majorHAnsi"/>
+          <w:i/>
+          <w:iCs/>
+        </w:rPr>
+        <w:t>tickets_available</w:t>
+      </w:r>
+      <w:proofErr w:type="spellEnd"/>
+      <w:r>
+        <w:rPr>
+          <w:rFonts w:asciiTheme="majorHAnsi" w:hAnsiTheme="majorHAnsi" w:cstheme="majorHAnsi"/>
+          <w:i/>
+          <w:iCs/>
+        </w:rPr>
+        <w:t xml:space="preserve"> &gt; 0) {   // Điều kiện vẫn đúng vì A chưa trừ vé</w:t>
+      </w:r>
+    </w:p>
+    <w:p>
+      <w:pPr>
+        <w:rPr>
+          <w:rFonts w:asciiTheme="majorHAnsi" w:hAnsiTheme="majorHAnsi" w:cstheme="majorHAnsi"/>
+          <w:i/>
+          <w:iCs/>
+        </w:rPr>
+      </w:pPr>
+      <w:r>
+        <w:rPr>
+          <w:rFonts w:asciiTheme="majorHAnsi" w:hAnsiTheme="majorHAnsi" w:cstheme="majorHAnsi"/>
+          <w:i/>
+          <w:iCs/>
+        </w:rPr>
+        <w:t xml:space="preserve">2.     </w:t>
+      </w:r>
+      <w:proofErr w:type="spellStart"/>
+      <w:r>
+        <w:rPr>
+          <w:rFonts w:asciiTheme="majorHAnsi" w:hAnsiTheme="majorHAnsi" w:cstheme="majorHAnsi"/>
+          <w:i/>
+          <w:iCs/>
+        </w:rPr>
+        <w:t>in_ve_cho_nguoi_dung_B</w:t>
+      </w:r>
+      <w:proofErr w:type="spellEnd"/>
+      <w:r>
+        <w:rPr>
+          <w:rFonts w:asciiTheme="majorHAnsi" w:hAnsiTheme="majorHAnsi" w:cstheme="majorHAnsi"/>
+          <w:i/>
+          <w:iCs/>
+        </w:rPr>
+        <w:t>();  // B mua vé thành công</w:t>
+      </w:r>
+    </w:p>
+    <w:p>
+      <w:pPr>
+        <w:rPr>
+          <w:rFonts w:asciiTheme="majorHAnsi" w:hAnsiTheme="majorHAnsi" w:cstheme="majorHAnsi"/>
+          <w:i/>
+          <w:iCs/>
+        </w:rPr>
+      </w:pPr>
+      <w:r>
+        <w:rPr>
+          <w:rFonts w:asciiTheme="majorHAnsi" w:hAnsiTheme="majorHAnsi" w:cstheme="majorHAnsi"/>
+          <w:i/>
+          <w:iCs/>
+        </w:rPr>
+        <w:t xml:space="preserve">3.     </w:t>
+      </w:r>
+      <w:proofErr w:type="spellStart"/>
+      <w:r>
+        <w:rPr>
+          <w:rFonts w:asciiTheme="majorHAnsi" w:hAnsiTheme="majorHAnsi" w:cstheme="majorHAnsi"/>
+          <w:i/>
+          <w:iCs/>
+        </w:rPr>
+        <w:t>tickets_available</w:t>
+      </w:r>
+      <w:proofErr w:type="spellEnd"/>
+      <w:r>
+        <w:rPr>
+          <w:rFonts w:asciiTheme="majorHAnsi" w:hAnsiTheme="majorHAnsi" w:cstheme="majorHAnsi"/>
+          <w:i/>
+          <w:iCs/>
+        </w:rPr>
+        <w:t xml:space="preserve"> = </w:t>
+      </w:r>
+      <w:proofErr w:type="spellStart"/>
+      <w:r>
+        <w:rPr>
+          <w:rFonts w:asciiTheme="majorHAnsi" w:hAnsiTheme="majorHAnsi" w:cstheme="majorHAnsi"/>
+          <w:i/>
+          <w:iCs/>
+        </w:rPr>
+        <w:t>tickets_available</w:t>
+      </w:r>
+      <w:proofErr w:type="spellEnd"/>
+      <w:r>
+        <w:rPr>
+          <w:rFonts w:asciiTheme="majorHAnsi" w:hAnsiTheme="majorHAnsi" w:cstheme="majorHAnsi"/>
+          <w:i/>
+          <w:iCs/>
+        </w:rPr>
+        <w:t xml:space="preserve"> - 1; // </w:t>
+      </w:r>
+      <w:proofErr w:type="spellStart"/>
+      <w:r>
+        <w:rPr>
+          <w:rFonts w:asciiTheme="majorHAnsi" w:hAnsiTheme="majorHAnsi" w:cstheme="majorHAnsi"/>
+          <w:i/>
+          <w:iCs/>
+        </w:rPr>
+        <w:t>tickets</w:t>
+      </w:r>
+      <w:proofErr w:type="spellEnd"/>
+      <w:r>
+        <w:rPr>
+          <w:rFonts w:asciiTheme="majorHAnsi" w:hAnsiTheme="majorHAnsi" w:cstheme="majorHAnsi"/>
+          <w:i/>
+          <w:iCs/>
+        </w:rPr>
+        <w:t xml:space="preserve"> = 0</w:t>
+      </w:r>
+    </w:p>
+    <w:p>
+      <w:pPr>
+        <w:rPr>
+          <w:rFonts w:asciiTheme="majorHAnsi" w:hAnsiTheme="majorHAnsi" w:cstheme="majorHAnsi"/>
+          <w:i/>
+          <w:iCs/>
+        </w:rPr>
+      </w:pPr>
+      <w:r>
+        <w:rPr>
+          <w:rFonts w:asciiTheme="majorHAnsi" w:hAnsiTheme="majorHAnsi" w:cstheme="majorHAnsi"/>
+          <w:i/>
+          <w:iCs/>
+        </w:rPr>
+        <w:t>4. }</w:t>
+      </w:r>
+    </w:p>
+    <w:p>
+      <w:pPr>
+        <w:rPr>
+          <w:rFonts w:asciiTheme="majorHAnsi" w:hAnsiTheme="majorHAnsi" w:cstheme="majorHAnsi"/>
+          <w:i/>
+          <w:iCs/>
+        </w:rPr>
+      </w:pPr>
+    </w:p>
+    <w:p>
+      <w:pPr>
+        <w:rPr>
+          <w:rFonts w:asciiTheme="majorHAnsi" w:hAnsiTheme="majorHAnsi" w:cstheme="majorHAnsi"/>
+          <w:i/>
+          <w:iCs/>
+        </w:rPr>
+      </w:pPr>
+      <w:r>
+        <w:rPr>
+          <w:rFonts w:asciiTheme="majorHAnsi" w:hAnsiTheme="majorHAnsi" w:cstheme="majorHAnsi"/>
+          <w:i/>
+          <w:iCs/>
+        </w:rPr>
+        <w:t xml:space="preserve">// -- OS cấp CPU lại cho </w:t>
+      </w:r>
+      <w:proofErr w:type="spellStart"/>
+      <w:r>
+        <w:rPr>
+          <w:rFonts w:asciiTheme="majorHAnsi" w:hAnsiTheme="majorHAnsi" w:cstheme="majorHAnsi"/>
+          <w:i/>
+          <w:iCs/>
+        </w:rPr>
+        <w:t>Thread</w:t>
+      </w:r>
+      <w:proofErr w:type="spellEnd"/>
+      <w:r>
+        <w:rPr>
+          <w:rFonts w:asciiTheme="majorHAnsi" w:hAnsiTheme="majorHAnsi" w:cstheme="majorHAnsi"/>
+          <w:i/>
+          <w:iCs/>
+        </w:rPr>
+        <w:t xml:space="preserve"> A --</w:t>
+      </w:r>
+    </w:p>
+    <w:p>
+      <w:pPr>
+        <w:rPr>
+          <w:rFonts w:asciiTheme="majorHAnsi" w:hAnsiTheme="majorHAnsi" w:cstheme="majorHAnsi"/>
+          <w:i/>
+          <w:iCs/>
+        </w:rPr>
+      </w:pPr>
+      <w:r>
+        <w:rPr>
+          <w:rFonts w:asciiTheme="majorHAnsi" w:hAnsiTheme="majorHAnsi" w:cstheme="majorHAnsi"/>
+          <w:i/>
+          <w:iCs/>
+        </w:rPr>
+        <w:t xml:space="preserve">// </w:t>
+      </w:r>
+      <w:proofErr w:type="spellStart"/>
+      <w:r>
+        <w:rPr>
+          <w:rFonts w:asciiTheme="majorHAnsi" w:hAnsiTheme="majorHAnsi" w:cstheme="majorHAnsi"/>
+          <w:i/>
+          <w:iCs/>
+        </w:rPr>
+        <w:t>Thread</w:t>
+      </w:r>
+      <w:proofErr w:type="spellEnd"/>
+      <w:r>
+        <w:rPr>
+          <w:rFonts w:asciiTheme="majorHAnsi" w:hAnsiTheme="majorHAnsi" w:cstheme="majorHAnsi"/>
+          <w:i/>
+          <w:iCs/>
+        </w:rPr>
+        <w:t xml:space="preserve"> A đã qua được </w:t>
+      </w:r>
+      <w:proofErr w:type="spellStart"/>
+      <w:r>
+        <w:rPr>
+          <w:rFonts w:asciiTheme="majorHAnsi" w:hAnsiTheme="majorHAnsi" w:cstheme="majorHAnsi"/>
+          <w:i/>
+          <w:iCs/>
+        </w:rPr>
+        <w:t>if</w:t>
+      </w:r>
+      <w:proofErr w:type="spellEnd"/>
+      <w:r>
+        <w:rPr>
+          <w:rFonts w:asciiTheme="majorHAnsi" w:hAnsiTheme="majorHAnsi" w:cstheme="majorHAnsi"/>
+          <w:i/>
+          <w:iCs/>
+        </w:rPr>
+        <w:t>, cứ thế chạy tiếp bước 2 và 3</w:t>
+      </w:r>
+    </w:p>
+    <w:p>
+      <w:pPr>
+        <w:rPr>
+          <w:rFonts w:asciiTheme="majorHAnsi" w:hAnsiTheme="majorHAnsi" w:cstheme="majorHAnsi"/>
+          <w:i/>
+          <w:iCs/>
+        </w:rPr>
+      </w:pPr>
+      <w:r>
+        <w:rPr>
+          <w:rFonts w:asciiTheme="majorHAnsi" w:hAnsiTheme="majorHAnsi" w:cstheme="majorHAnsi"/>
+          <w:i/>
+          <w:iCs/>
+        </w:rPr>
+        <w:t xml:space="preserve">2.     </w:t>
+      </w:r>
+      <w:proofErr w:type="spellStart"/>
+      <w:r>
+        <w:rPr>
+          <w:rFonts w:asciiTheme="majorHAnsi" w:hAnsiTheme="majorHAnsi" w:cstheme="majorHAnsi"/>
+          <w:i/>
+          <w:iCs/>
+        </w:rPr>
+        <w:t>in_ve_cho_nguoi_dung_A</w:t>
+      </w:r>
+      <w:proofErr w:type="spellEnd"/>
+      <w:r>
+        <w:rPr>
+          <w:rFonts w:asciiTheme="majorHAnsi" w:hAnsiTheme="majorHAnsi" w:cstheme="majorHAnsi"/>
+          <w:i/>
+          <w:iCs/>
+        </w:rPr>
+        <w:t>();  // A mua vé thành công</w:t>
+      </w:r>
+    </w:p>
+    <w:p>
+      <w:pPr>
+        <w:rPr>
+          <w:rFonts w:asciiTheme="majorHAnsi" w:hAnsiTheme="majorHAnsi" w:cstheme="majorHAnsi"/>
+          <w:i/>
+          <w:iCs/>
+        </w:rPr>
+      </w:pPr>
+      <w:r>
+        <w:rPr>
+          <w:rFonts w:asciiTheme="majorHAnsi" w:hAnsiTheme="majorHAnsi" w:cstheme="majorHAnsi"/>
+          <w:i/>
+          <w:iCs/>
+        </w:rPr>
+        <w:t xml:space="preserve">3.     </w:t>
+      </w:r>
+      <w:proofErr w:type="spellStart"/>
+      <w:r>
+        <w:rPr>
+          <w:rFonts w:asciiTheme="majorHAnsi" w:hAnsiTheme="majorHAnsi" w:cstheme="majorHAnsi"/>
+          <w:i/>
+          <w:iCs/>
+        </w:rPr>
+        <w:t>tickets_available</w:t>
+      </w:r>
+      <w:proofErr w:type="spellEnd"/>
+      <w:r>
+        <w:rPr>
+          <w:rFonts w:asciiTheme="majorHAnsi" w:hAnsiTheme="majorHAnsi" w:cstheme="majorHAnsi"/>
+          <w:i/>
+          <w:iCs/>
+        </w:rPr>
+        <w:t xml:space="preserve"> = </w:t>
+      </w:r>
+      <w:proofErr w:type="spellStart"/>
+      <w:r>
+        <w:rPr>
+          <w:rFonts w:asciiTheme="majorHAnsi" w:hAnsiTheme="majorHAnsi" w:cstheme="majorHAnsi"/>
+          <w:i/>
+          <w:iCs/>
+        </w:rPr>
+        <w:t>tickets_available</w:t>
+      </w:r>
+      <w:proofErr w:type="spellEnd"/>
+      <w:r>
+        <w:rPr>
+          <w:rFonts w:asciiTheme="majorHAnsi" w:hAnsiTheme="majorHAnsi" w:cstheme="majorHAnsi"/>
+          <w:i/>
+          <w:iCs/>
+        </w:rPr>
+        <w:t xml:space="preserve"> - 1; // </w:t>
+      </w:r>
+      <w:proofErr w:type="spellStart"/>
+      <w:r>
+        <w:rPr>
+          <w:rFonts w:asciiTheme="majorHAnsi" w:hAnsiTheme="majorHAnsi" w:cstheme="majorHAnsi"/>
+          <w:i/>
+          <w:iCs/>
+        </w:rPr>
+        <w:t>tickets</w:t>
+      </w:r>
+      <w:proofErr w:type="spellEnd"/>
+      <w:r>
+        <w:rPr>
+          <w:rFonts w:asciiTheme="majorHAnsi" w:hAnsiTheme="majorHAnsi" w:cstheme="majorHAnsi"/>
+          <w:i/>
+          <w:iCs/>
+        </w:rPr>
+        <w:t xml:space="preserve"> = -1</w:t>
+      </w:r>
+    </w:p>
+    <w:p>
+      <w:pPr>
+        <w:rPr>
+          <w:rFonts w:asciiTheme="majorHAnsi" w:hAnsiTheme="majorHAnsi" w:cstheme="majorHAnsi"/>
+          <w:i/>
+          <w:iCs/>
+        </w:rPr>
+      </w:pPr>
+      <w:r>
+        <w:rPr>
+          <w:rFonts w:asciiTheme="majorHAnsi" w:hAnsiTheme="majorHAnsi" w:cstheme="majorHAnsi"/>
+          <w:i/>
+          <w:iCs/>
+        </w:rPr>
+        <w:t>4. }</w:t>
+      </w:r>
+    </w:p>
+    <w:p>
+      <w:pPr>
+        <w:rPr>
+          <w:rFonts w:asciiTheme="majorHAnsi" w:hAnsiTheme="majorHAnsi" w:cstheme="majorHAnsi"/>
+        </w:rPr>
+      </w:pPr>
+      <w:r>
+        <w:rPr>
+          <w:rFonts w:asciiTheme="majorHAnsi" w:hAnsiTheme="majorHAnsi" w:cstheme="majorHAnsi"/>
+          <w:b/>
+          <w:bCs/>
+        </w:rPr>
+        <w:lastRenderedPageBreak/>
+        <w:t>Hậu quả:</w:t>
+      </w:r>
+      <w:r>
+        <w:rPr>
+          <w:rFonts w:asciiTheme="majorHAnsi" w:hAnsiTheme="majorHAnsi" w:cstheme="majorHAnsi"/>
+        </w:rPr>
+        <w:t xml:space="preserve"> Hệ thống bán ra 2 vé máy bay trong khi thực tế chỉ còn đúng 1 vé (</w:t>
+      </w:r>
+      <w:proofErr w:type="spellStart"/>
+      <w:r>
+        <w:rPr>
+          <w:rFonts w:asciiTheme="majorHAnsi" w:hAnsiTheme="majorHAnsi" w:cstheme="majorHAnsi"/>
+        </w:rPr>
+        <w:t>Overselling</w:t>
+      </w:r>
+      <w:proofErr w:type="spellEnd"/>
+      <w:r>
+        <w:rPr>
+          <w:rFonts w:asciiTheme="majorHAnsi" w:hAnsiTheme="majorHAnsi" w:cstheme="majorHAnsi"/>
+        </w:rPr>
+        <w:t>/</w:t>
+      </w:r>
+      <w:proofErr w:type="spellStart"/>
+      <w:r>
+        <w:rPr>
+          <w:rFonts w:asciiTheme="majorHAnsi" w:hAnsiTheme="majorHAnsi" w:cstheme="majorHAnsi"/>
+        </w:rPr>
+        <w:t>Double</w:t>
+      </w:r>
+      <w:proofErr w:type="spellEnd"/>
+      <w:r>
+        <w:rPr>
+          <w:rFonts w:asciiTheme="majorHAnsi" w:hAnsiTheme="majorHAnsi" w:cstheme="majorHAnsi"/>
+        </w:rPr>
+        <w:t xml:space="preserve"> </w:t>
+      </w:r>
+      <w:proofErr w:type="spellStart"/>
+      <w:r>
+        <w:rPr>
+          <w:rFonts w:asciiTheme="majorHAnsi" w:hAnsiTheme="majorHAnsi" w:cstheme="majorHAnsi"/>
+        </w:rPr>
+        <w:t>Booking</w:t>
+      </w:r>
+      <w:proofErr w:type="spellEnd"/>
+      <w:r>
+        <w:rPr>
+          <w:rFonts w:asciiTheme="majorHAnsi" w:hAnsiTheme="majorHAnsi" w:cstheme="majorHAnsi"/>
+        </w:rPr>
+        <w:t>).</w:t>
+      </w:r>
+    </w:p>
+    <w:p>
+      <w:pPr>
+        <w:rPr>
+          <w:rFonts w:asciiTheme="majorHAnsi" w:hAnsiTheme="majorHAnsi" w:cstheme="majorHAnsi"/>
+          <w:b/>
+          <w:bCs/>
+        </w:rPr>
+      </w:pPr>
+      <w:r>
+        <w:rPr>
+          <w:rFonts w:asciiTheme="majorHAnsi" w:hAnsiTheme="majorHAnsi" w:cstheme="majorHAnsi"/>
+          <w:b/>
+          <w:bCs/>
+        </w:rPr>
+        <w:t>Ví dụ 3: Cạnh tranh khi thao tác với Cấu trúc dữ liệu (Danh sách liên kết)</w:t>
+      </w:r>
+    </w:p>
+    <w:p>
+      <w:pPr>
+        <w:rPr>
+          <w:rFonts w:asciiTheme="majorHAnsi" w:hAnsiTheme="majorHAnsi" w:cstheme="majorHAnsi"/>
+          <w:i/>
+          <w:iCs/>
+        </w:rPr>
+      </w:pPr>
+      <w:r>
+        <w:rPr>
+          <w:rFonts w:asciiTheme="majorHAnsi" w:hAnsiTheme="majorHAnsi" w:cstheme="majorHAnsi"/>
+          <w:i/>
+          <w:iCs/>
+        </w:rPr>
+        <w:t xml:space="preserve">// Danh sách liên kết có nút </w:t>
+      </w:r>
+      <w:proofErr w:type="spellStart"/>
+      <w:r>
+        <w:rPr>
+          <w:rFonts w:asciiTheme="majorHAnsi" w:hAnsiTheme="majorHAnsi" w:cstheme="majorHAnsi"/>
+          <w:i/>
+          <w:iCs/>
+        </w:rPr>
+        <w:t>Head</w:t>
+      </w:r>
+      <w:proofErr w:type="spellEnd"/>
+      <w:r>
+        <w:rPr>
+          <w:rFonts w:asciiTheme="majorHAnsi" w:hAnsiTheme="majorHAnsi" w:cstheme="majorHAnsi"/>
+          <w:i/>
+          <w:iCs/>
+        </w:rPr>
+        <w:t xml:space="preserve"> đang trỏ tới </w:t>
+      </w:r>
+      <w:proofErr w:type="spellStart"/>
+      <w:r>
+        <w:rPr>
+          <w:rFonts w:asciiTheme="majorHAnsi" w:hAnsiTheme="majorHAnsi" w:cstheme="majorHAnsi"/>
+          <w:i/>
+          <w:iCs/>
+        </w:rPr>
+        <w:t>Null</w:t>
+      </w:r>
+      <w:proofErr w:type="spellEnd"/>
+    </w:p>
+    <w:p>
+      <w:pPr>
+        <w:rPr>
+          <w:rFonts w:asciiTheme="majorHAnsi" w:hAnsiTheme="majorHAnsi" w:cstheme="majorHAnsi"/>
+          <w:i/>
+          <w:iCs/>
+        </w:rPr>
+      </w:pPr>
+      <w:proofErr w:type="spellStart"/>
+      <w:r>
+        <w:rPr>
+          <w:rFonts w:asciiTheme="majorHAnsi" w:hAnsiTheme="majorHAnsi" w:cstheme="majorHAnsi"/>
+          <w:i/>
+          <w:iCs/>
+        </w:rPr>
+        <w:t>Node</w:t>
+      </w:r>
+      <w:proofErr w:type="spellEnd"/>
+      <w:r>
+        <w:rPr>
+          <w:rFonts w:asciiTheme="majorHAnsi" w:hAnsiTheme="majorHAnsi" w:cstheme="majorHAnsi"/>
+          <w:i/>
+          <w:iCs/>
+        </w:rPr>
+        <w:t xml:space="preserve"> </w:t>
+      </w:r>
+      <w:proofErr w:type="spellStart"/>
+      <w:r>
+        <w:rPr>
+          <w:rFonts w:asciiTheme="majorHAnsi" w:hAnsiTheme="majorHAnsi" w:cstheme="majorHAnsi"/>
+          <w:i/>
+          <w:iCs/>
+        </w:rPr>
+        <w:t>head</w:t>
+      </w:r>
+      <w:proofErr w:type="spellEnd"/>
+      <w:r>
+        <w:rPr>
+          <w:rFonts w:asciiTheme="majorHAnsi" w:hAnsiTheme="majorHAnsi" w:cstheme="majorHAnsi"/>
+          <w:i/>
+          <w:iCs/>
+        </w:rPr>
+        <w:t xml:space="preserve"> = NULL;</w:t>
+      </w:r>
+    </w:p>
+    <w:p>
+      <w:pPr>
+        <w:rPr>
+          <w:rFonts w:asciiTheme="majorHAnsi" w:hAnsiTheme="majorHAnsi" w:cstheme="majorHAnsi"/>
+          <w:i/>
+          <w:iCs/>
+        </w:rPr>
+      </w:pPr>
+    </w:p>
+    <w:p>
+      <w:pPr>
+        <w:rPr>
+          <w:rFonts w:asciiTheme="majorHAnsi" w:hAnsiTheme="majorHAnsi" w:cstheme="majorHAnsi"/>
+          <w:i/>
+          <w:iCs/>
+        </w:rPr>
+      </w:pPr>
+      <w:proofErr w:type="spellStart"/>
+      <w:r>
+        <w:rPr>
+          <w:rFonts w:asciiTheme="majorHAnsi" w:hAnsiTheme="majorHAnsi" w:cstheme="majorHAnsi"/>
+          <w:i/>
+          <w:iCs/>
+        </w:rPr>
+        <w:t>Thread</w:t>
+      </w:r>
+      <w:proofErr w:type="spellEnd"/>
+      <w:r>
+        <w:rPr>
+          <w:rFonts w:asciiTheme="majorHAnsi" w:hAnsiTheme="majorHAnsi" w:cstheme="majorHAnsi"/>
+          <w:i/>
+          <w:iCs/>
+        </w:rPr>
+        <w:t xml:space="preserve"> A (Chèn </w:t>
+      </w:r>
+      <w:proofErr w:type="spellStart"/>
+      <w:r>
+        <w:rPr>
+          <w:rFonts w:asciiTheme="majorHAnsi" w:hAnsiTheme="majorHAnsi" w:cstheme="majorHAnsi"/>
+          <w:i/>
+          <w:iCs/>
+        </w:rPr>
+        <w:t>Node_A</w:t>
+      </w:r>
+      <w:proofErr w:type="spellEnd"/>
+      <w:r>
+        <w:rPr>
+          <w:rFonts w:asciiTheme="majorHAnsi" w:hAnsiTheme="majorHAnsi" w:cstheme="majorHAnsi"/>
+          <w:i/>
+          <w:iCs/>
+        </w:rPr>
+        <w:t xml:space="preserve"> vào đầu danh sách):</w:t>
+      </w:r>
+    </w:p>
+    <w:p>
+      <w:pPr>
+        <w:rPr>
+          <w:rFonts w:asciiTheme="majorHAnsi" w:hAnsiTheme="majorHAnsi" w:cstheme="majorHAnsi"/>
+          <w:i/>
+          <w:iCs/>
+        </w:rPr>
+      </w:pPr>
+      <w:r>
+        <w:rPr>
+          <w:rFonts w:asciiTheme="majorHAnsi" w:hAnsiTheme="majorHAnsi" w:cstheme="majorHAnsi"/>
+          <w:i/>
+          <w:iCs/>
+        </w:rPr>
+        <w:t xml:space="preserve">1. </w:t>
+      </w:r>
+      <w:proofErr w:type="spellStart"/>
+      <w:r>
+        <w:rPr>
+          <w:rFonts w:asciiTheme="majorHAnsi" w:hAnsiTheme="majorHAnsi" w:cstheme="majorHAnsi"/>
+          <w:i/>
+          <w:iCs/>
+        </w:rPr>
+        <w:t>Node_A.next</w:t>
+      </w:r>
+      <w:proofErr w:type="spellEnd"/>
+      <w:r>
+        <w:rPr>
+          <w:rFonts w:asciiTheme="majorHAnsi" w:hAnsiTheme="majorHAnsi" w:cstheme="majorHAnsi"/>
+          <w:i/>
+          <w:iCs/>
+        </w:rPr>
+        <w:t xml:space="preserve"> = </w:t>
+      </w:r>
+      <w:proofErr w:type="spellStart"/>
+      <w:r>
+        <w:rPr>
+          <w:rFonts w:asciiTheme="majorHAnsi" w:hAnsiTheme="majorHAnsi" w:cstheme="majorHAnsi"/>
+          <w:i/>
+          <w:iCs/>
+        </w:rPr>
+        <w:t>head</w:t>
+      </w:r>
+      <w:proofErr w:type="spellEnd"/>
+      <w:r>
+        <w:rPr>
+          <w:rFonts w:asciiTheme="majorHAnsi" w:hAnsiTheme="majorHAnsi" w:cstheme="majorHAnsi"/>
+          <w:i/>
+          <w:iCs/>
+        </w:rPr>
+        <w:t xml:space="preserve">;      // </w:t>
+      </w:r>
+      <w:proofErr w:type="spellStart"/>
+      <w:r>
+        <w:rPr>
+          <w:rFonts w:asciiTheme="majorHAnsi" w:hAnsiTheme="majorHAnsi" w:cstheme="majorHAnsi"/>
+          <w:i/>
+          <w:iCs/>
+        </w:rPr>
+        <w:t>Node_A.next</w:t>
+      </w:r>
+      <w:proofErr w:type="spellEnd"/>
+      <w:r>
+        <w:rPr>
+          <w:rFonts w:asciiTheme="majorHAnsi" w:hAnsiTheme="majorHAnsi" w:cstheme="majorHAnsi"/>
+          <w:i/>
+          <w:iCs/>
+        </w:rPr>
+        <w:t xml:space="preserve"> trỏ tới NULL</w:t>
+      </w:r>
+    </w:p>
+    <w:p>
+      <w:pPr>
+        <w:rPr>
+          <w:rFonts w:asciiTheme="majorHAnsi" w:hAnsiTheme="majorHAnsi" w:cstheme="majorHAnsi"/>
+          <w:i/>
+          <w:iCs/>
+        </w:rPr>
+      </w:pPr>
+      <w:r>
+        <w:rPr>
+          <w:rFonts w:asciiTheme="majorHAnsi" w:hAnsiTheme="majorHAnsi" w:cstheme="majorHAnsi"/>
+          <w:i/>
+          <w:iCs/>
+        </w:rPr>
+        <w:t>// -- Bị ngắt --</w:t>
+      </w:r>
+    </w:p>
+    <w:p>
+      <w:pPr>
+        <w:rPr>
+          <w:rFonts w:asciiTheme="majorHAnsi" w:hAnsiTheme="majorHAnsi" w:cstheme="majorHAnsi"/>
+          <w:i/>
+          <w:iCs/>
+        </w:rPr>
+      </w:pPr>
+    </w:p>
+    <w:p>
+      <w:pPr>
+        <w:rPr>
+          <w:rFonts w:asciiTheme="majorHAnsi" w:hAnsiTheme="majorHAnsi" w:cstheme="majorHAnsi"/>
+          <w:i/>
+          <w:iCs/>
+        </w:rPr>
+      </w:pPr>
+      <w:proofErr w:type="spellStart"/>
+      <w:r>
+        <w:rPr>
+          <w:rFonts w:asciiTheme="majorHAnsi" w:hAnsiTheme="majorHAnsi" w:cstheme="majorHAnsi"/>
+          <w:i/>
+          <w:iCs/>
+        </w:rPr>
+        <w:t>Thread</w:t>
+      </w:r>
+      <w:proofErr w:type="spellEnd"/>
+      <w:r>
+        <w:rPr>
+          <w:rFonts w:asciiTheme="majorHAnsi" w:hAnsiTheme="majorHAnsi" w:cstheme="majorHAnsi"/>
+          <w:i/>
+          <w:iCs/>
+        </w:rPr>
+        <w:t xml:space="preserve"> B (Chèn </w:t>
+      </w:r>
+      <w:proofErr w:type="spellStart"/>
+      <w:r>
+        <w:rPr>
+          <w:rFonts w:asciiTheme="majorHAnsi" w:hAnsiTheme="majorHAnsi" w:cstheme="majorHAnsi"/>
+          <w:i/>
+          <w:iCs/>
+        </w:rPr>
+        <w:t>Node_B</w:t>
+      </w:r>
+      <w:proofErr w:type="spellEnd"/>
+      <w:r>
+        <w:rPr>
+          <w:rFonts w:asciiTheme="majorHAnsi" w:hAnsiTheme="majorHAnsi" w:cstheme="majorHAnsi"/>
+          <w:i/>
+          <w:iCs/>
+        </w:rPr>
+        <w:t xml:space="preserve"> vào đầu danh sách):</w:t>
+      </w:r>
+    </w:p>
+    <w:p>
+      <w:pPr>
+        <w:rPr>
+          <w:rFonts w:asciiTheme="majorHAnsi" w:hAnsiTheme="majorHAnsi" w:cstheme="majorHAnsi"/>
+          <w:i/>
+          <w:iCs/>
+        </w:rPr>
+      </w:pPr>
+      <w:r>
+        <w:rPr>
+          <w:rFonts w:asciiTheme="majorHAnsi" w:hAnsiTheme="majorHAnsi" w:cstheme="majorHAnsi"/>
+          <w:i/>
+          <w:iCs/>
+        </w:rPr>
+        <w:t xml:space="preserve">1. </w:t>
+      </w:r>
+      <w:proofErr w:type="spellStart"/>
+      <w:r>
+        <w:rPr>
+          <w:rFonts w:asciiTheme="majorHAnsi" w:hAnsiTheme="majorHAnsi" w:cstheme="majorHAnsi"/>
+          <w:i/>
+          <w:iCs/>
+        </w:rPr>
+        <w:t>Node_B.next</w:t>
+      </w:r>
+      <w:proofErr w:type="spellEnd"/>
+      <w:r>
+        <w:rPr>
+          <w:rFonts w:asciiTheme="majorHAnsi" w:hAnsiTheme="majorHAnsi" w:cstheme="majorHAnsi"/>
+          <w:i/>
+          <w:iCs/>
+        </w:rPr>
+        <w:t xml:space="preserve"> = </w:t>
+      </w:r>
+      <w:proofErr w:type="spellStart"/>
+      <w:r>
+        <w:rPr>
+          <w:rFonts w:asciiTheme="majorHAnsi" w:hAnsiTheme="majorHAnsi" w:cstheme="majorHAnsi"/>
+          <w:i/>
+          <w:iCs/>
+        </w:rPr>
+        <w:t>head</w:t>
+      </w:r>
+      <w:proofErr w:type="spellEnd"/>
+      <w:r>
+        <w:rPr>
+          <w:rFonts w:asciiTheme="majorHAnsi" w:hAnsiTheme="majorHAnsi" w:cstheme="majorHAnsi"/>
+          <w:i/>
+          <w:iCs/>
+        </w:rPr>
+        <w:t xml:space="preserve">;      // </w:t>
+      </w:r>
+      <w:proofErr w:type="spellStart"/>
+      <w:r>
+        <w:rPr>
+          <w:rFonts w:asciiTheme="majorHAnsi" w:hAnsiTheme="majorHAnsi" w:cstheme="majorHAnsi"/>
+          <w:i/>
+          <w:iCs/>
+        </w:rPr>
+        <w:t>Node_B.next</w:t>
+      </w:r>
+      <w:proofErr w:type="spellEnd"/>
+      <w:r>
+        <w:rPr>
+          <w:rFonts w:asciiTheme="majorHAnsi" w:hAnsiTheme="majorHAnsi" w:cstheme="majorHAnsi"/>
+          <w:i/>
+          <w:iCs/>
+        </w:rPr>
+        <w:t xml:space="preserve"> trỏ tới NULL</w:t>
+      </w:r>
+    </w:p>
+    <w:p>
+      <w:pPr>
+        <w:rPr>
+          <w:rFonts w:asciiTheme="majorHAnsi" w:hAnsiTheme="majorHAnsi" w:cstheme="majorHAnsi"/>
+          <w:i/>
+          <w:iCs/>
+        </w:rPr>
+      </w:pPr>
+      <w:r>
+        <w:rPr>
+          <w:rFonts w:asciiTheme="majorHAnsi" w:hAnsiTheme="majorHAnsi" w:cstheme="majorHAnsi"/>
+          <w:i/>
+          <w:iCs/>
+        </w:rPr>
+        <w:t xml:space="preserve">2. </w:t>
+      </w:r>
+      <w:proofErr w:type="spellStart"/>
+      <w:r>
+        <w:rPr>
+          <w:rFonts w:asciiTheme="majorHAnsi" w:hAnsiTheme="majorHAnsi" w:cstheme="majorHAnsi"/>
+          <w:i/>
+          <w:iCs/>
+        </w:rPr>
+        <w:t>head</w:t>
+      </w:r>
+      <w:proofErr w:type="spellEnd"/>
+      <w:r>
+        <w:rPr>
+          <w:rFonts w:asciiTheme="majorHAnsi" w:hAnsiTheme="majorHAnsi" w:cstheme="majorHAnsi"/>
+          <w:i/>
+          <w:iCs/>
+        </w:rPr>
+        <w:t xml:space="preserve"> = </w:t>
+      </w:r>
+      <w:proofErr w:type="spellStart"/>
+      <w:r>
+        <w:rPr>
+          <w:rFonts w:asciiTheme="majorHAnsi" w:hAnsiTheme="majorHAnsi" w:cstheme="majorHAnsi"/>
+          <w:i/>
+          <w:iCs/>
+        </w:rPr>
+        <w:t>Node_B</w:t>
+      </w:r>
+      <w:proofErr w:type="spellEnd"/>
+      <w:r>
+        <w:rPr>
+          <w:rFonts w:asciiTheme="majorHAnsi" w:hAnsiTheme="majorHAnsi" w:cstheme="majorHAnsi"/>
+          <w:i/>
+          <w:iCs/>
+        </w:rPr>
+        <w:t xml:space="preserve">;           // Danh sách cập nhật: </w:t>
+      </w:r>
+      <w:proofErr w:type="spellStart"/>
+      <w:r>
+        <w:rPr>
+          <w:rFonts w:asciiTheme="majorHAnsi" w:hAnsiTheme="majorHAnsi" w:cstheme="majorHAnsi"/>
+          <w:i/>
+          <w:iCs/>
+        </w:rPr>
+        <w:t>Head</w:t>
+      </w:r>
+      <w:proofErr w:type="spellEnd"/>
+      <w:r>
+        <w:rPr>
+          <w:rFonts w:asciiTheme="majorHAnsi" w:hAnsiTheme="majorHAnsi" w:cstheme="majorHAnsi"/>
+          <w:i/>
+          <w:iCs/>
+        </w:rPr>
+        <w:t xml:space="preserve"> -&gt; </w:t>
+      </w:r>
+      <w:proofErr w:type="spellStart"/>
+      <w:r>
+        <w:rPr>
+          <w:rFonts w:asciiTheme="majorHAnsi" w:hAnsiTheme="majorHAnsi" w:cstheme="majorHAnsi"/>
+          <w:i/>
+          <w:iCs/>
+        </w:rPr>
+        <w:t>Node_B</w:t>
+      </w:r>
+      <w:proofErr w:type="spellEnd"/>
+      <w:r>
+        <w:rPr>
+          <w:rFonts w:asciiTheme="majorHAnsi" w:hAnsiTheme="majorHAnsi" w:cstheme="majorHAnsi"/>
+          <w:i/>
+          <w:iCs/>
+        </w:rPr>
+        <w:t xml:space="preserve"> -&gt; NULL</w:t>
+      </w:r>
+    </w:p>
+    <w:p>
+      <w:pPr>
+        <w:rPr>
+          <w:rFonts w:asciiTheme="majorHAnsi" w:hAnsiTheme="majorHAnsi" w:cstheme="majorHAnsi"/>
+          <w:i/>
+          <w:iCs/>
+        </w:rPr>
+      </w:pPr>
+    </w:p>
+    <w:p>
+      <w:pPr>
+        <w:rPr>
+          <w:rFonts w:asciiTheme="majorHAnsi" w:hAnsiTheme="majorHAnsi" w:cstheme="majorHAnsi"/>
+          <w:i/>
+          <w:iCs/>
+        </w:rPr>
+      </w:pPr>
+      <w:r>
+        <w:rPr>
+          <w:rFonts w:asciiTheme="majorHAnsi" w:hAnsiTheme="majorHAnsi" w:cstheme="majorHAnsi"/>
+          <w:i/>
+          <w:iCs/>
+        </w:rPr>
+        <w:t xml:space="preserve">// -- OS cấp CPU lại cho </w:t>
+      </w:r>
+      <w:proofErr w:type="spellStart"/>
+      <w:r>
+        <w:rPr>
+          <w:rFonts w:asciiTheme="majorHAnsi" w:hAnsiTheme="majorHAnsi" w:cstheme="majorHAnsi"/>
+          <w:i/>
+          <w:iCs/>
+        </w:rPr>
+        <w:t>Thread</w:t>
+      </w:r>
+      <w:proofErr w:type="spellEnd"/>
+      <w:r>
+        <w:rPr>
+          <w:rFonts w:asciiTheme="majorHAnsi" w:hAnsiTheme="majorHAnsi" w:cstheme="majorHAnsi"/>
+          <w:i/>
+          <w:iCs/>
+        </w:rPr>
+        <w:t xml:space="preserve"> A --</w:t>
+      </w:r>
+    </w:p>
+    <w:p>
+      <w:pPr>
+        <w:rPr>
+          <w:rFonts w:asciiTheme="majorHAnsi" w:hAnsiTheme="majorHAnsi" w:cstheme="majorHAnsi"/>
+          <w:i/>
+          <w:iCs/>
+        </w:rPr>
+      </w:pPr>
+      <w:r>
+        <w:rPr>
+          <w:rFonts w:asciiTheme="majorHAnsi" w:hAnsiTheme="majorHAnsi" w:cstheme="majorHAnsi"/>
+          <w:i/>
+          <w:iCs/>
+        </w:rPr>
+        <w:t xml:space="preserve">2. </w:t>
+      </w:r>
+      <w:proofErr w:type="spellStart"/>
+      <w:r>
+        <w:rPr>
+          <w:rFonts w:asciiTheme="majorHAnsi" w:hAnsiTheme="majorHAnsi" w:cstheme="majorHAnsi"/>
+          <w:i/>
+          <w:iCs/>
+        </w:rPr>
+        <w:t>head</w:t>
+      </w:r>
+      <w:proofErr w:type="spellEnd"/>
+      <w:r>
+        <w:rPr>
+          <w:rFonts w:asciiTheme="majorHAnsi" w:hAnsiTheme="majorHAnsi" w:cstheme="majorHAnsi"/>
+          <w:i/>
+          <w:iCs/>
+        </w:rPr>
+        <w:t xml:space="preserve"> = </w:t>
+      </w:r>
+      <w:proofErr w:type="spellStart"/>
+      <w:r>
+        <w:rPr>
+          <w:rFonts w:asciiTheme="majorHAnsi" w:hAnsiTheme="majorHAnsi" w:cstheme="majorHAnsi"/>
+          <w:i/>
+          <w:iCs/>
+        </w:rPr>
+        <w:t>Node_A</w:t>
+      </w:r>
+      <w:proofErr w:type="spellEnd"/>
+      <w:r>
+        <w:rPr>
+          <w:rFonts w:asciiTheme="majorHAnsi" w:hAnsiTheme="majorHAnsi" w:cstheme="majorHAnsi"/>
+          <w:i/>
+          <w:iCs/>
+        </w:rPr>
+        <w:t xml:space="preserve">;           // Danh sách cập nhật: </w:t>
+      </w:r>
+      <w:proofErr w:type="spellStart"/>
+      <w:r>
+        <w:rPr>
+          <w:rFonts w:asciiTheme="majorHAnsi" w:hAnsiTheme="majorHAnsi" w:cstheme="majorHAnsi"/>
+          <w:i/>
+          <w:iCs/>
+        </w:rPr>
+        <w:t>Head</w:t>
+      </w:r>
+      <w:proofErr w:type="spellEnd"/>
+      <w:r>
+        <w:rPr>
+          <w:rFonts w:asciiTheme="majorHAnsi" w:hAnsiTheme="majorHAnsi" w:cstheme="majorHAnsi"/>
+          <w:i/>
+          <w:iCs/>
+        </w:rPr>
+        <w:t xml:space="preserve"> -&gt; </w:t>
+      </w:r>
+      <w:proofErr w:type="spellStart"/>
+      <w:r>
+        <w:rPr>
+          <w:rFonts w:asciiTheme="majorHAnsi" w:hAnsiTheme="majorHAnsi" w:cstheme="majorHAnsi"/>
+          <w:i/>
+          <w:iCs/>
+        </w:rPr>
+        <w:t>Node_A</w:t>
+      </w:r>
+      <w:proofErr w:type="spellEnd"/>
+      <w:r>
+        <w:rPr>
+          <w:rFonts w:asciiTheme="majorHAnsi" w:hAnsiTheme="majorHAnsi" w:cstheme="majorHAnsi"/>
+          <w:i/>
+          <w:iCs/>
+        </w:rPr>
+        <w:t xml:space="preserve"> -&gt; NULL</w:t>
+      </w:r>
+    </w:p>
+    <w:p>
+      <w:pPr>
+        <w:rPr>
+          <w:rFonts w:asciiTheme="majorHAnsi" w:hAnsiTheme="majorHAnsi" w:cstheme="majorHAnsi"/>
+          <w:i/>
+          <w:iCs/>
+        </w:rPr>
+      </w:pPr>
+    </w:p>
+    <w:p>
+      <w:pPr>
+        <w:rPr>
+          <w:rFonts w:asciiTheme="majorHAnsi" w:hAnsiTheme="majorHAnsi" w:cstheme="majorHAnsi"/>
+        </w:rPr>
+      </w:pPr>
+      <w:r>
+        <w:rPr>
+          <w:rFonts w:asciiTheme="majorHAnsi" w:hAnsiTheme="majorHAnsi" w:cstheme="majorHAnsi"/>
+          <w:b/>
+          <w:bCs/>
+        </w:rPr>
+        <w:t>Hậu quả:</w:t>
+      </w:r>
+      <w:r>
+        <w:rPr>
+          <w:rFonts w:asciiTheme="majorHAnsi" w:hAnsiTheme="majorHAnsi" w:cstheme="majorHAnsi"/>
+        </w:rPr>
+        <w:t xml:space="preserve"> </w:t>
+      </w:r>
+      <w:proofErr w:type="spellStart"/>
+      <w:r>
+        <w:rPr>
+          <w:rFonts w:asciiTheme="majorHAnsi" w:hAnsiTheme="majorHAnsi" w:cstheme="majorHAnsi"/>
+        </w:rPr>
+        <w:t>Node_B</w:t>
+      </w:r>
+      <w:proofErr w:type="spellEnd"/>
+      <w:r>
+        <w:rPr>
+          <w:rFonts w:asciiTheme="majorHAnsi" w:hAnsiTheme="majorHAnsi" w:cstheme="majorHAnsi"/>
+        </w:rPr>
+        <w:t xml:space="preserve"> vừa được chèn vào đã bị trôi dạt khỏi danh sách liên kết hoàn toàn, không thể truy cập được nữa. Gây thất thoát dữ liệu nghiêm trọng và rò rỉ bộ nhớ (</w:t>
+      </w:r>
+      <w:proofErr w:type="spellStart"/>
+      <w:r>
+        <w:rPr>
+          <w:rFonts w:asciiTheme="majorHAnsi" w:hAnsiTheme="majorHAnsi" w:cstheme="majorHAnsi"/>
+        </w:rPr>
+        <w:t>Memory</w:t>
+      </w:r>
+      <w:proofErr w:type="spellEnd"/>
+      <w:r>
+        <w:rPr>
+          <w:rFonts w:asciiTheme="majorHAnsi" w:hAnsiTheme="majorHAnsi" w:cstheme="majorHAnsi"/>
+        </w:rPr>
+        <w:t xml:space="preserve"> </w:t>
+      </w:r>
+      <w:proofErr w:type="spellStart"/>
+      <w:r>
+        <w:rPr>
+          <w:rFonts w:asciiTheme="majorHAnsi" w:hAnsiTheme="majorHAnsi" w:cstheme="majorHAnsi"/>
+        </w:rPr>
+        <w:t>Leak</w:t>
+      </w:r>
+      <w:proofErr w:type="spellEnd"/>
+      <w:r>
+        <w:rPr>
+          <w:rFonts w:asciiTheme="majorHAnsi" w:hAnsiTheme="majorHAnsi" w:cstheme="majorHAnsi"/>
+        </w:rPr>
+        <w:t>).</w:t>
+      </w:r>
+    </w:p>
+    <w:p>
+      <w:pPr>
+        <w:rPr>
+          <w:rFonts w:asciiTheme="majorHAnsi" w:hAnsiTheme="majorHAnsi" w:cstheme="majorHAnsi"/>
+          <w:b/>
+          <w:bCs/>
+        </w:rPr>
+      </w:pPr>
+      <w:r>
+        <w:rPr>
+          <w:rFonts w:asciiTheme="majorHAnsi" w:hAnsiTheme="majorHAnsi" w:cstheme="majorHAnsi"/>
+          <w:b/>
+          <w:bCs/>
+        </w:rPr>
+        <w:t>Ví dụ 4: Lỗi TOCTOU (</w:t>
+      </w:r>
+      <w:proofErr w:type="spellStart"/>
+      <w:r>
+        <w:rPr>
+          <w:rFonts w:asciiTheme="majorHAnsi" w:hAnsiTheme="majorHAnsi" w:cstheme="majorHAnsi"/>
+          <w:b/>
+          <w:bCs/>
+        </w:rPr>
+        <w:t>Time-of-Check</w:t>
+      </w:r>
+      <w:proofErr w:type="spellEnd"/>
+      <w:r>
+        <w:rPr>
+          <w:rFonts w:asciiTheme="majorHAnsi" w:hAnsiTheme="majorHAnsi" w:cstheme="majorHAnsi"/>
+          <w:b/>
+          <w:bCs/>
+        </w:rPr>
+        <w:t xml:space="preserve"> to </w:t>
+      </w:r>
+      <w:proofErr w:type="spellStart"/>
+      <w:r>
+        <w:rPr>
+          <w:rFonts w:asciiTheme="majorHAnsi" w:hAnsiTheme="majorHAnsi" w:cstheme="majorHAnsi"/>
+          <w:b/>
+          <w:bCs/>
+        </w:rPr>
+        <w:t>Time-of-Use</w:t>
+      </w:r>
+      <w:proofErr w:type="spellEnd"/>
+      <w:r>
+        <w:rPr>
+          <w:rFonts w:asciiTheme="majorHAnsi" w:hAnsiTheme="majorHAnsi" w:cstheme="majorHAnsi"/>
+          <w:b/>
+          <w:bCs/>
+        </w:rPr>
+        <w:t>) trong bảo mật</w:t>
+      </w:r>
+    </w:p>
+    <w:p>
+      <w:pPr>
+        <w:rPr>
+          <w:rFonts w:asciiTheme="majorHAnsi" w:hAnsiTheme="majorHAnsi" w:cstheme="majorHAnsi"/>
+        </w:rPr>
+      </w:pPr>
+      <w:r>
+        <w:rPr>
+          <w:rFonts w:asciiTheme="majorHAnsi" w:hAnsiTheme="majorHAnsi" w:cstheme="majorHAnsi"/>
+        </w:rPr>
+        <w:t xml:space="preserve"> </w:t>
+      </w:r>
+    </w:p>
+    <w:p>
+      <w:pPr>
+        <w:rPr>
+          <w:rFonts w:asciiTheme="majorHAnsi" w:hAnsiTheme="majorHAnsi" w:cstheme="majorHAnsi"/>
+          <w:i/>
+          <w:iCs/>
+        </w:rPr>
+      </w:pPr>
+      <w:r>
+        <w:rPr>
+          <w:rFonts w:asciiTheme="majorHAnsi" w:hAnsiTheme="majorHAnsi" w:cstheme="majorHAnsi"/>
+          <w:i/>
+          <w:iCs/>
+        </w:rPr>
+        <w:t xml:space="preserve">// Cài đặt: Người dùng chỉ có quyền với </w:t>
+      </w:r>
+      <w:proofErr w:type="spellStart"/>
+      <w:r>
+        <w:rPr>
+          <w:rFonts w:asciiTheme="majorHAnsi" w:hAnsiTheme="majorHAnsi" w:cstheme="majorHAnsi"/>
+          <w:i/>
+          <w:iCs/>
+        </w:rPr>
+        <w:t>file</w:t>
+      </w:r>
+      <w:proofErr w:type="spellEnd"/>
+      <w:r>
+        <w:rPr>
+          <w:rFonts w:asciiTheme="majorHAnsi" w:hAnsiTheme="majorHAnsi" w:cstheme="majorHAnsi"/>
+          <w:i/>
+          <w:iCs/>
+        </w:rPr>
+        <w:t xml:space="preserve"> "temp.txt". </w:t>
+      </w:r>
+    </w:p>
+    <w:p>
+      <w:pPr>
+        <w:rPr>
+          <w:rFonts w:asciiTheme="majorHAnsi" w:hAnsiTheme="majorHAnsi" w:cstheme="majorHAnsi"/>
+          <w:i/>
+          <w:iCs/>
+        </w:rPr>
+      </w:pPr>
+      <w:r>
+        <w:rPr>
+          <w:rFonts w:asciiTheme="majorHAnsi" w:hAnsiTheme="majorHAnsi" w:cstheme="majorHAnsi"/>
+          <w:i/>
+          <w:iCs/>
+        </w:rPr>
+        <w:t xml:space="preserve">// Không có quyền với </w:t>
+      </w:r>
+      <w:proofErr w:type="spellStart"/>
+      <w:r>
+        <w:rPr>
+          <w:rFonts w:asciiTheme="majorHAnsi" w:hAnsiTheme="majorHAnsi" w:cstheme="majorHAnsi"/>
+          <w:i/>
+          <w:iCs/>
+        </w:rPr>
+        <w:t>file</w:t>
+      </w:r>
+      <w:proofErr w:type="spellEnd"/>
+      <w:r>
+        <w:rPr>
+          <w:rFonts w:asciiTheme="majorHAnsi" w:hAnsiTheme="majorHAnsi" w:cstheme="majorHAnsi"/>
+          <w:i/>
+          <w:iCs/>
+        </w:rPr>
+        <w:t xml:space="preserve"> hệ thống "password.txt"</w:t>
+      </w:r>
+    </w:p>
+    <w:p>
+      <w:pPr>
+        <w:rPr>
+          <w:rFonts w:asciiTheme="majorHAnsi" w:hAnsiTheme="majorHAnsi" w:cstheme="majorHAnsi"/>
+          <w:i/>
+          <w:iCs/>
+        </w:rPr>
+      </w:pPr>
+    </w:p>
+    <w:p>
+      <w:pPr>
+        <w:rPr>
+          <w:rFonts w:asciiTheme="majorHAnsi" w:hAnsiTheme="majorHAnsi" w:cstheme="majorHAnsi"/>
+          <w:i/>
+          <w:iCs/>
+        </w:rPr>
+      </w:pPr>
+      <w:proofErr w:type="spellStart"/>
+      <w:r>
+        <w:rPr>
+          <w:rFonts w:asciiTheme="majorHAnsi" w:hAnsiTheme="majorHAnsi" w:cstheme="majorHAnsi"/>
+          <w:i/>
+          <w:iCs/>
+        </w:rPr>
+        <w:t>Thread</w:t>
+      </w:r>
+      <w:proofErr w:type="spellEnd"/>
+      <w:r>
+        <w:rPr>
+          <w:rFonts w:asciiTheme="majorHAnsi" w:hAnsiTheme="majorHAnsi" w:cstheme="majorHAnsi"/>
+          <w:i/>
+          <w:iCs/>
+        </w:rPr>
+        <w:t xml:space="preserve"> A (Chương trình hệ thống đang chạy bằng quyền </w:t>
+      </w:r>
+      <w:proofErr w:type="spellStart"/>
+      <w:r>
+        <w:rPr>
+          <w:rFonts w:asciiTheme="majorHAnsi" w:hAnsiTheme="majorHAnsi" w:cstheme="majorHAnsi"/>
+          <w:i/>
+          <w:iCs/>
+        </w:rPr>
+        <w:t>Admin</w:t>
+      </w:r>
+      <w:proofErr w:type="spellEnd"/>
+      <w:r>
+        <w:rPr>
+          <w:rFonts w:asciiTheme="majorHAnsi" w:hAnsiTheme="majorHAnsi" w:cstheme="majorHAnsi"/>
+          <w:i/>
+          <w:iCs/>
+        </w:rPr>
+        <w:t>):</w:t>
+      </w:r>
+    </w:p>
+    <w:p>
+      <w:pPr>
+        <w:rPr>
+          <w:rFonts w:asciiTheme="majorHAnsi" w:hAnsiTheme="majorHAnsi" w:cstheme="majorHAnsi"/>
+          <w:i/>
+          <w:iCs/>
+        </w:rPr>
+      </w:pPr>
+      <w:r>
+        <w:rPr>
+          <w:rFonts w:asciiTheme="majorHAnsi" w:hAnsiTheme="majorHAnsi" w:cstheme="majorHAnsi"/>
+          <w:i/>
+          <w:iCs/>
+        </w:rPr>
+        <w:t xml:space="preserve">1. </w:t>
+      </w:r>
+      <w:proofErr w:type="spellStart"/>
+      <w:r>
+        <w:rPr>
+          <w:rFonts w:asciiTheme="majorHAnsi" w:hAnsiTheme="majorHAnsi" w:cstheme="majorHAnsi"/>
+          <w:i/>
+          <w:iCs/>
+        </w:rPr>
+        <w:t>if</w:t>
+      </w:r>
+      <w:proofErr w:type="spellEnd"/>
+      <w:r>
+        <w:rPr>
+          <w:rFonts w:asciiTheme="majorHAnsi" w:hAnsiTheme="majorHAnsi" w:cstheme="majorHAnsi"/>
+          <w:i/>
+          <w:iCs/>
+        </w:rPr>
+        <w:t xml:space="preserve"> (</w:t>
+      </w:r>
+      <w:proofErr w:type="spellStart"/>
+      <w:r>
+        <w:rPr>
+          <w:rFonts w:asciiTheme="majorHAnsi" w:hAnsiTheme="majorHAnsi" w:cstheme="majorHAnsi"/>
+          <w:i/>
+          <w:iCs/>
+        </w:rPr>
+        <w:t>KiemTraQuyenTruyCap</w:t>
+      </w:r>
+      <w:proofErr w:type="spellEnd"/>
+      <w:r>
+        <w:rPr>
+          <w:rFonts w:asciiTheme="majorHAnsi" w:hAnsiTheme="majorHAnsi" w:cstheme="majorHAnsi"/>
+          <w:i/>
+          <w:iCs/>
+        </w:rPr>
+        <w:t>(</w:t>
+      </w:r>
+      <w:proofErr w:type="spellStart"/>
+      <w:r>
+        <w:rPr>
+          <w:rFonts w:asciiTheme="majorHAnsi" w:hAnsiTheme="majorHAnsi" w:cstheme="majorHAnsi"/>
+          <w:i/>
+          <w:iCs/>
+        </w:rPr>
+        <w:t>nguoi_dung</w:t>
+      </w:r>
+      <w:proofErr w:type="spellEnd"/>
+      <w:r>
+        <w:rPr>
+          <w:rFonts w:asciiTheme="majorHAnsi" w:hAnsiTheme="majorHAnsi" w:cstheme="majorHAnsi"/>
+          <w:i/>
+          <w:iCs/>
+        </w:rPr>
+        <w:t>, "temp.txt") == HOP_LE) {</w:t>
+      </w:r>
+    </w:p>
+    <w:p>
+      <w:pPr>
+        <w:rPr>
+          <w:rFonts w:asciiTheme="majorHAnsi" w:hAnsiTheme="majorHAnsi" w:cstheme="majorHAnsi"/>
+          <w:i/>
+          <w:iCs/>
+        </w:rPr>
+      </w:pPr>
+      <w:r>
+        <w:rPr>
+          <w:rFonts w:asciiTheme="majorHAnsi" w:hAnsiTheme="majorHAnsi" w:cstheme="majorHAnsi"/>
+          <w:i/>
+          <w:iCs/>
+        </w:rPr>
+        <w:t>// -- Bị ngắt --</w:t>
+      </w:r>
+    </w:p>
+    <w:p>
+      <w:pPr>
+        <w:rPr>
+          <w:rFonts w:asciiTheme="majorHAnsi" w:hAnsiTheme="majorHAnsi" w:cstheme="majorHAnsi"/>
+          <w:i/>
+          <w:iCs/>
+        </w:rPr>
+      </w:pPr>
+      <w:r>
+        <w:rPr>
+          <w:rFonts w:asciiTheme="majorHAnsi" w:hAnsiTheme="majorHAnsi" w:cstheme="majorHAnsi"/>
+          <w:i/>
+          <w:iCs/>
+        </w:rPr>
+        <w:t xml:space="preserve">2.     </w:t>
+      </w:r>
+      <w:proofErr w:type="spellStart"/>
+      <w:r>
+        <w:rPr>
+          <w:rFonts w:asciiTheme="majorHAnsi" w:hAnsiTheme="majorHAnsi" w:cstheme="majorHAnsi"/>
+          <w:i/>
+          <w:iCs/>
+        </w:rPr>
+        <w:t>GhiDuLieuVaoFile</w:t>
+      </w:r>
+      <w:proofErr w:type="spellEnd"/>
+      <w:r>
+        <w:rPr>
+          <w:rFonts w:asciiTheme="majorHAnsi" w:hAnsiTheme="majorHAnsi" w:cstheme="majorHAnsi"/>
+          <w:i/>
+          <w:iCs/>
+        </w:rPr>
+        <w:t xml:space="preserve">("temp.txt", </w:t>
+      </w:r>
+      <w:proofErr w:type="spellStart"/>
+      <w:r>
+        <w:rPr>
+          <w:rFonts w:asciiTheme="majorHAnsi" w:hAnsiTheme="majorHAnsi" w:cstheme="majorHAnsi"/>
+          <w:i/>
+          <w:iCs/>
+        </w:rPr>
+        <w:t>du_lieu_nhay_cam</w:t>
+      </w:r>
+      <w:proofErr w:type="spellEnd"/>
+      <w:r>
+        <w:rPr>
+          <w:rFonts w:asciiTheme="majorHAnsi" w:hAnsiTheme="majorHAnsi" w:cstheme="majorHAnsi"/>
+          <w:i/>
+          <w:iCs/>
+        </w:rPr>
+        <w:t>);</w:t>
+      </w:r>
+    </w:p>
+    <w:p>
+      <w:pPr>
+        <w:rPr>
+          <w:rFonts w:asciiTheme="majorHAnsi" w:hAnsiTheme="majorHAnsi" w:cstheme="majorHAnsi"/>
+          <w:i/>
+          <w:iCs/>
+        </w:rPr>
+      </w:pPr>
+      <w:r>
+        <w:rPr>
+          <w:rFonts w:asciiTheme="majorHAnsi" w:hAnsiTheme="majorHAnsi" w:cstheme="majorHAnsi"/>
+          <w:i/>
+          <w:iCs/>
+        </w:rPr>
+        <w:t>3. }</w:t>
+      </w:r>
+    </w:p>
+    <w:p>
+      <w:pPr>
+        <w:rPr>
+          <w:i/>
+          <w:iCs/>
+        </w:rPr>
+      </w:pPr>
+    </w:p>
+    <w:p>
+      <w:pPr>
+        <w:rPr>
+          <w:i/>
+          <w:iCs/>
+        </w:rPr>
+      </w:pPr>
+      <w:proofErr w:type="spellStart"/>
+      <w:r>
+        <w:rPr>
+          <w:i/>
+          <w:iCs/>
+        </w:rPr>
+        <w:lastRenderedPageBreak/>
+        <w:t>Thread</w:t>
+      </w:r>
+      <w:proofErr w:type="spellEnd"/>
+      <w:r>
+        <w:rPr>
+          <w:i/>
+          <w:iCs/>
+        </w:rPr>
+        <w:t xml:space="preserve"> B (Kẻ tấn công chạy một </w:t>
+      </w:r>
+      <w:proofErr w:type="spellStart"/>
+      <w:r>
+        <w:rPr>
+          <w:i/>
+          <w:iCs/>
+        </w:rPr>
+        <w:t>script</w:t>
+      </w:r>
+      <w:proofErr w:type="spellEnd"/>
+      <w:r>
+        <w:rPr>
+          <w:i/>
+          <w:iCs/>
+        </w:rPr>
+        <w:t xml:space="preserve"> liên tục):</w:t>
+      </w:r>
+    </w:p>
+    <w:p>
+      <w:pPr>
+        <w:rPr>
+          <w:i/>
+          <w:iCs/>
+        </w:rPr>
+      </w:pPr>
+      <w:r>
+        <w:rPr>
+          <w:i/>
+          <w:iCs/>
+        </w:rPr>
+        <w:t xml:space="preserve">// Thao tác đổi </w:t>
+      </w:r>
+      <w:proofErr w:type="spellStart"/>
+      <w:r>
+        <w:rPr>
+          <w:i/>
+          <w:iCs/>
+        </w:rPr>
+        <w:t>file</w:t>
+      </w:r>
+      <w:proofErr w:type="spellEnd"/>
+      <w:r>
+        <w:rPr>
+          <w:i/>
+          <w:iCs/>
+        </w:rPr>
+        <w:t xml:space="preserve"> diễn ra ngay giữa khoảng "</w:t>
+      </w:r>
+      <w:proofErr w:type="spellStart"/>
+      <w:r>
+        <w:rPr>
+          <w:i/>
+          <w:iCs/>
+        </w:rPr>
+        <w:t>Check</w:t>
+      </w:r>
+      <w:proofErr w:type="spellEnd"/>
+      <w:r>
+        <w:rPr>
+          <w:i/>
+          <w:iCs/>
+        </w:rPr>
+        <w:t>" và "</w:t>
+      </w:r>
+      <w:proofErr w:type="spellStart"/>
+      <w:r>
+        <w:rPr>
+          <w:i/>
+          <w:iCs/>
+        </w:rPr>
+        <w:t>Use</w:t>
+      </w:r>
+      <w:proofErr w:type="spellEnd"/>
+      <w:r>
+        <w:rPr>
+          <w:i/>
+          <w:iCs/>
+        </w:rPr>
+        <w:t xml:space="preserve">" của </w:t>
+      </w:r>
+      <w:proofErr w:type="spellStart"/>
+      <w:r>
+        <w:rPr>
+          <w:i/>
+          <w:iCs/>
+        </w:rPr>
+        <w:t>Thread</w:t>
+      </w:r>
+      <w:proofErr w:type="spellEnd"/>
+      <w:r>
+        <w:rPr>
+          <w:i/>
+          <w:iCs/>
+        </w:rPr>
+        <w:t xml:space="preserve"> A</w:t>
+      </w:r>
+    </w:p>
+    <w:p>
+      <w:pPr>
+        <w:rPr>
+          <w:i/>
+          <w:iCs/>
+        </w:rPr>
+      </w:pPr>
+      <w:r>
+        <w:rPr>
+          <w:i/>
+          <w:iCs/>
+        </w:rPr>
+        <w:t xml:space="preserve">1. </w:t>
+      </w:r>
+      <w:proofErr w:type="spellStart"/>
+      <w:r>
+        <w:rPr>
+          <w:i/>
+          <w:iCs/>
+        </w:rPr>
+        <w:t>Xoa_File</w:t>
+      </w:r>
+      <w:proofErr w:type="spellEnd"/>
+      <w:r>
+        <w:rPr>
+          <w:i/>
+          <w:iCs/>
+        </w:rPr>
+        <w:t>("temp.txt");</w:t>
+      </w:r>
+    </w:p>
+    <w:p>
+      <w:pPr>
+        <w:rPr>
+          <w:i/>
+          <w:iCs/>
+        </w:rPr>
+      </w:pPr>
+      <w:r>
+        <w:rPr>
+          <w:i/>
+          <w:iCs/>
+        </w:rPr>
+        <w:t xml:space="preserve">2. </w:t>
+      </w:r>
+      <w:proofErr w:type="spellStart"/>
+      <w:r>
+        <w:rPr>
+          <w:i/>
+          <w:iCs/>
+        </w:rPr>
+        <w:t>Tao_Symlink</w:t>
+      </w:r>
+      <w:proofErr w:type="spellEnd"/>
+      <w:r>
+        <w:rPr>
+          <w:i/>
+          <w:iCs/>
+        </w:rPr>
+        <w:t>(</w:t>
+      </w:r>
+      <w:proofErr w:type="spellStart"/>
+      <w:r>
+        <w:rPr>
+          <w:i/>
+          <w:iCs/>
+        </w:rPr>
+        <w:t>ten_file</w:t>
+      </w:r>
+      <w:proofErr w:type="spellEnd"/>
+      <w:r>
+        <w:rPr>
+          <w:i/>
+          <w:iCs/>
+        </w:rPr>
+        <w:t xml:space="preserve">: "temp.txt", </w:t>
+      </w:r>
+      <w:proofErr w:type="spellStart"/>
+      <w:r>
+        <w:rPr>
+          <w:i/>
+          <w:iCs/>
+        </w:rPr>
+        <w:t>tro_toi_file</w:t>
+      </w:r>
+      <w:proofErr w:type="spellEnd"/>
+      <w:r>
+        <w:rPr>
+          <w:i/>
+          <w:iCs/>
+        </w:rPr>
+        <w:t>: "password.txt");</w:t>
+      </w:r>
+    </w:p>
+    <w:p>
+      <w:r>
+        <w:rPr>
+          <w:b/>
+          <w:bCs/>
+        </w:rPr>
+        <w:t>Hậu quả:</w:t>
+      </w:r>
+      <w:r>
+        <w:t xml:space="preserve"> Chương trình hệ thống (</w:t>
+      </w:r>
+      <w:proofErr w:type="spellStart"/>
+      <w:r>
+        <w:t>Thread</w:t>
+      </w:r>
+      <w:proofErr w:type="spellEnd"/>
+      <w:r>
+        <w:t xml:space="preserve"> A) kiểm tra ở bước 1 thấy temp.txt hợp lệ. Nhưng khi nó thực hiện lệnh ghi ở bước 2, temp.txt thực chất đã trở thành một đường dẫn trỏ thẳng đến password.txt do kẻ tấn công (</w:t>
+      </w:r>
+      <w:proofErr w:type="spellStart"/>
+      <w:r>
+        <w:t>Thread</w:t>
+      </w:r>
+      <w:proofErr w:type="spellEnd"/>
+      <w:r>
+        <w:t xml:space="preserve"> B) đánh tráo. Hệ thống vô tình dùng quyền </w:t>
+      </w:r>
+      <w:proofErr w:type="spellStart"/>
+      <w:r>
+        <w:t>Admin</w:t>
+      </w:r>
+      <w:proofErr w:type="spellEnd"/>
+      <w:r>
+        <w:t xml:space="preserve"> để ghi đè dữ liệu vào </w:t>
+      </w:r>
+      <w:proofErr w:type="spellStart"/>
+      <w:r>
+        <w:t>file</w:t>
+      </w:r>
+      <w:proofErr w:type="spellEnd"/>
+      <w:r>
+        <w:t xml:space="preserve"> mật khẩu cốt lõi.</w:t>
+      </w:r>
+    </w:p>
     <w:sectPr>
       <w:pgSz w:w="11906" w:h="16838"/>
       <w:pgMar w:top="1440" w:right="1440" w:bottom="1440" w:left="1440" w:header="708" w:footer="708" w:gutter="0"/>
@@ -1228,7 +4018,6 @@
   <w:style w:type="character" w:default="1" w:styleId="Phngmcinhcuaoanvn">
     <w:name w:val="Default Paragraph Font"/>
     <w:uiPriority w:val="1"/>
-    <w:semiHidden/>
     <w:unhideWhenUsed/>
   </w:style>
   <w:style w:type="table" w:default="1" w:styleId="BangThngthng">

</xml_diff>